<commit_message>
docs(ti): corregir titulos de los 4 ERS e incorporar documentos finales de los talleres TI.1 (TI.1.1 a TI.1.4)
</commit_message>
<xml_diff>
--- a/TI.1.1. PAO202651_SOAP_JAVA_SINBDD_NRC36884_GR09/01. UML/01. ERS/ERS_SOAP_JAVA_SINBDD_GR09.docx
+++ b/TI.1.1. PAO202651_SOAP_JAVA_SINBDD_NRC36884_GR09/01. UML/01. ERS/ERS_SOAP_JAVA_SINBDD_GR09.docx
@@ -108,27 +108,6 @@
                               </w:rPr>
                               <w:t>ESPECIFICACIÓN DE REQUERIMIENTOS DE SOFTWARE PARA SOA CON SOAP EN JAVA SIN BDD</w:t>
                             </w:r>
-                            <w:r>
-                              <w:rPr>
-                                <w:sz w:val="44"/>
-                                <w:szCs w:val="44"/>
-                              </w:rPr>
-                              <w:t xml:space="preserve">ESPECIFICACIÓN DE REQUERIMIENTOS DE SOFTWARE PARA SOA CON SOAP EN JAVA SIN BDD</w:t>
-                            </w:r>
-                            <w:r>
-                              <w:rPr>
-                                <w:sz w:val="44"/>
-                                <w:szCs w:val="44"/>
-                              </w:rPr>
-                              <w:t>SOAP</w:t>
-                            </w:r>
-                            <w:r>
-                              <w:rPr>
-                                <w:sz w:val="44"/>
-                                <w:szCs w:val="44"/>
-                              </w:rPr>
-                              <w:t xml:space="preserve"> EN JAVA SIN BDD</w:t>
-                            </w:r>
                           </w:p>
                           <w:p>
                             <w:pPr>
@@ -183,7 +162,7 @@
                               <w:jc w:val="center"/>
                             </w:pPr>
                             <w:r>
-                              <w:t/>
+                              <w:t>Murillo Medina, Gabriel Omar</w:t>
                             </w:r>
                           </w:p>
                           <w:p>
@@ -417,27 +396,6 @@
                         </w:rPr>
                         <w:t>ESPECIFICACIÓN DE REQUERIMIENTOS DE SOFTWARE PARA SOA CON SOAP EN JAVA SIN BDD</w:t>
                       </w:r>
-                      <w:r>
-                        <w:rPr>
-                          <w:sz w:val="44"/>
-                          <w:szCs w:val="44"/>
-                        </w:rPr>
-                        <w:t xml:space="preserve">ESPECIFICACIÓN DE REQUERIMIENTOS DE SOFTWARE PARA SOA CON SOAP EN JAVA SIN BDD</w:t>
-                      </w:r>
-                      <w:r>
-                        <w:rPr>
-                          <w:sz w:val="44"/>
-                          <w:szCs w:val="44"/>
-                        </w:rPr>
-                        <w:t>SOAP</w:t>
-                      </w:r>
-                      <w:r>
-                        <w:rPr>
-                          <w:sz w:val="44"/>
-                          <w:szCs w:val="44"/>
-                        </w:rPr>
-                        <w:t xml:space="preserve"> EN JAVA SIN BDD</w:t>
-                      </w:r>
                     </w:p>
                     <w:p>
                       <w:pPr>
@@ -492,7 +450,7 @@
                         <w:jc w:val="center"/>
                       </w:pPr>
                       <w:r>
-                        <w:t/>
+                        <w:t>Murillo Medina, Gabriel Omar</w:t>
                       </w:r>
                     </w:p>
                     <w:p>
@@ -4373,7 +4331,7 @@
                 <w:rStyle w:val="Hipervnculo"/>
                 <w:noProof/>
               </w:rPr>
-              <w:t>ESPECIFICACIÓN DE REQUERIMIENTOS DEL PARA SOA CON SOAP EN JAVA SIN BDD</w:t>
+              <w:t>ESPECIFICACIÓN DE REQUERIMIENTOS DE SOFTWARE PARA SOA CON SOAP EN JAVA SIN BDD</w:t>
             </w:r>
             <w:r>
               <w:rPr>

</xml_diff>

<commit_message>
fix(ers): remover resaltados amarillos de texto y unificar estilo de tablas RF y RNF
</commit_message>
<xml_diff>
--- a/TI.1.1. PAO202651_SOAP_JAVA_SINBDD_NRC36884_GR09/01. UML/01. ERS/ERS_SOAP_JAVA_SINBDD_GR09.docx
+++ b/TI.1.1. PAO202651_SOAP_JAVA_SINBDD_NRC36884_GR09/01. UML/01. ERS/ERS_SOAP_JAVA_SINBDD_GR09.docx
@@ -12891,7 +12891,7 @@
       <w:pPr>
         <w:pStyle w:val="Descripcin"/>
         <w:rPr>
-          <w:rFonts w:ascii="Verdana" w:eastAsia="Droid Sans Fallback" w:hAnsi="Verdana" w:cstheme="minorHAnsi"/>
+          <w:rFonts w:ascii="Calibri" w:eastAsia="Droid Sans Fallback" w:hAnsi="Calibri" w:cstheme="minorHAnsi"/>
           <w:sz w:val="24"/>
           <w:lang w:val="es-EC"/>
         </w:rPr>
@@ -13489,52 +13489,37 @@
     <w:p>
       <w:pPr>
         <w:pStyle w:val="Descripcin"/>
-        <w:rPr>
-          <w:highlight w:val="yellow"/>
-        </w:rPr>
+        <w:rPr/>
       </w:pPr>
       <w:bookmarkStart w:id="65" w:name="_Toc83812961"/>
       <w:r>
-        <w:rPr>
-          <w:highlight w:val="yellow"/>
-        </w:rPr>
+        <w:rPr/>
         <w:t xml:space="preserve">Tabla </w:t>
       </w:r>
       <w:r>
-        <w:rPr>
-          <w:highlight w:val="yellow"/>
-        </w:rPr>
+        <w:rPr/>
         <w:fldChar w:fldCharType="begin"/>
       </w:r>
       <w:r>
-        <w:rPr>
-          <w:highlight w:val="yellow"/>
-        </w:rPr>
+        <w:rPr/>
         <w:instrText xml:space="preserve"> SEQ Tabla \* ARABIC </w:instrText>
       </w:r>
       <w:r>
-        <w:rPr>
-          <w:highlight w:val="yellow"/>
-        </w:rPr>
+        <w:rPr/>
         <w:fldChar w:fldCharType="separate"/>
       </w:r>
       <w:r>
         <w:rPr>
           <w:noProof/>
-          <w:highlight w:val="yellow"/>
         </w:rPr>
         <w:t>18</w:t>
       </w:r>
       <w:r>
-        <w:rPr>
-          <w:highlight w:val="yellow"/>
-        </w:rPr>
+        <w:rPr/>
         <w:fldChar w:fldCharType="end"/>
       </w:r>
       <w:r>
-        <w:rPr>
-          <w:highlight w:val="yellow"/>
-        </w:rPr>
+        <w:rPr/>
         <w:t>. Lista de requisitos funcionales</w:t>
       </w:r>
       <w:bookmarkEnd w:id="65"/>
@@ -13562,14 +13547,10 @@
           </w:tcPr>
           <w:p>
             <w:pPr>
-              <w:rPr>
-                <w:highlight w:val="yellow"/>
-              </w:rPr>
-            </w:pPr>
-            <w:r>
-              <w:rPr>
-                <w:highlight w:val="yellow"/>
-              </w:rPr>
+              <w:rPr/>
+            </w:pPr>
+            <w:r>
+              <w:rPr/>
               <w:t>Código</w:t>
             </w:r>
           </w:p>
@@ -13581,14 +13562,10 @@
           <w:p>
             <w:pPr>
               <w:cnfStyle w:val="100000000000" w:firstRow="1" w:lastRow="0" w:firstColumn="0" w:lastColumn="0" w:oddVBand="0" w:evenVBand="0" w:oddHBand="0" w:evenHBand="0" w:firstRowFirstColumn="0" w:firstRowLastColumn="0" w:lastRowFirstColumn="0" w:lastRowLastColumn="0"/>
-              <w:rPr>
-                <w:highlight w:val="yellow"/>
-              </w:rPr>
-            </w:pPr>
-            <w:r>
-              <w:rPr>
-                <w:highlight w:val="yellow"/>
-              </w:rPr>
+              <w:rPr/>
+            </w:pPr>
+            <w:r>
+              <w:rPr/>
               <w:t>Requerimiento</w:t>
             </w:r>
           </w:p>
@@ -13600,14 +13577,10 @@
           <w:p>
             <w:pPr>
               <w:cnfStyle w:val="100000000000" w:firstRow="1" w:lastRow="0" w:firstColumn="0" w:lastColumn="0" w:oddVBand="0" w:evenVBand="0" w:oddHBand="0" w:evenHBand="0" w:firstRowFirstColumn="0" w:firstRowLastColumn="0" w:lastRowFirstColumn="0" w:lastRowLastColumn="0"/>
-              <w:rPr>
-                <w:highlight w:val="yellow"/>
-              </w:rPr>
-            </w:pPr>
-            <w:r>
-              <w:rPr>
-                <w:highlight w:val="yellow"/>
-              </w:rPr>
+              <w:rPr/>
+            </w:pPr>
+            <w:r>
+              <w:rPr/>
               <w:t>Caso de uso</w:t>
             </w:r>
           </w:p>
@@ -13619,14 +13592,10 @@
           <w:p>
             <w:pPr>
               <w:cnfStyle w:val="100000000000" w:firstRow="1" w:lastRow="0" w:firstColumn="0" w:lastColumn="0" w:oddVBand="0" w:evenVBand="0" w:oddHBand="0" w:evenHBand="0" w:firstRowFirstColumn="0" w:firstRowLastColumn="0" w:lastRowFirstColumn="0" w:lastRowLastColumn="0"/>
-              <w:rPr>
-                <w:highlight w:val="yellow"/>
-              </w:rPr>
-            </w:pPr>
-            <w:r>
-              <w:rPr>
-                <w:highlight w:val="yellow"/>
-              </w:rPr>
+              <w:rPr/>
+            </w:pPr>
+            <w:r>
+              <w:rPr/>
               <w:t>Actor</w:t>
             </w:r>
           </w:p>
@@ -13643,14 +13612,10 @@
           </w:tcPr>
           <w:p>
             <w:pPr>
-              <w:rPr>
-                <w:highlight w:val="yellow"/>
-              </w:rPr>
-            </w:pPr>
-            <w:r>
-              <w:rPr>
-                <w:highlight w:val="yellow"/>
-              </w:rPr>
+              <w:rPr/>
+            </w:pPr>
+            <w:r>
+              <w:rPr/>
               <w:t xml:space="preserve">RF – 01 </w:t>
             </w:r>
           </w:p>
@@ -13662,14 +13627,10 @@
           <w:p>
             <w:pPr>
               <w:cnfStyle w:val="000000100000" w:firstRow="0" w:lastRow="0" w:firstColumn="0" w:lastColumn="0" w:oddVBand="0" w:evenVBand="0" w:oddHBand="1" w:evenHBand="0" w:firstRowFirstColumn="0" w:firstRowLastColumn="0" w:lastRowFirstColumn="0" w:lastRowLastColumn="0"/>
-              <w:rPr>
-                <w:highlight w:val="yellow"/>
-              </w:rPr>
-            </w:pPr>
-            <w:r>
-              <w:rPr>
-                <w:highlight w:val="yellow"/>
-              </w:rPr>
+              <w:rPr/>
+            </w:pPr>
+            <w:r>
+              <w:rPr/>
               <w:t>El sistema debe recibir credenciales de acceso, validarlas y generar un token de seguridad temporal para autorizar el uso de los servicios.</w:t>
             </w:r>
           </w:p>
@@ -13681,26 +13642,18 @@
           <w:p>
             <w:pPr>
               <w:cnfStyle w:val="000000100000" w:firstRow="0" w:lastRow="0" w:firstColumn="0" w:lastColumn="0" w:oddVBand="0" w:evenVBand="0" w:oddHBand="1" w:evenHBand="0" w:firstRowFirstColumn="0" w:firstRowLastColumn="0" w:lastRowFirstColumn="0" w:lastRowLastColumn="0"/>
-              <w:rPr>
-                <w:highlight w:val="yellow"/>
-              </w:rPr>
-            </w:pPr>
-            <w:r>
-              <w:rPr>
-                <w:highlight w:val="yellow"/>
-              </w:rPr>
+              <w:rPr/>
+            </w:pPr>
+            <w:r>
+              <w:rPr/>
               <w:t>Autenticar</w:t>
             </w:r>
             <w:r>
-              <w:rPr>
-                <w:highlight w:val="yellow"/>
-              </w:rPr>
+              <w:rPr/>
               <w:t xml:space="preserve"> Cliente</w:t>
             </w:r>
             <w:r>
-              <w:rPr>
-                <w:highlight w:val="yellow"/>
-              </w:rPr>
+              <w:rPr/>
               <w:t xml:space="preserve"> </w:t>
             </w:r>
           </w:p>
@@ -13712,14 +13665,10 @@
           <w:p>
             <w:pPr>
               <w:cnfStyle w:val="000000100000" w:firstRow="0" w:lastRow="0" w:firstColumn="0" w:lastColumn="0" w:oddVBand="0" w:evenVBand="0" w:oddHBand="1" w:evenHBand="0" w:firstRowFirstColumn="0" w:firstRowLastColumn="0" w:lastRowFirstColumn="0" w:lastRowLastColumn="0"/>
-              <w:rPr>
-                <w:highlight w:val="yellow"/>
-              </w:rPr>
-            </w:pPr>
-            <w:r>
-              <w:rPr>
-                <w:highlight w:val="yellow"/>
-              </w:rPr>
+              <w:rPr/>
+            </w:pPr>
+            <w:r>
+              <w:rPr/>
               <w:t>Usuario final</w:t>
             </w:r>
           </w:p>
@@ -13733,14 +13682,10 @@
           </w:tcPr>
           <w:p>
             <w:pPr>
-              <w:rPr>
-                <w:highlight w:val="yellow"/>
-              </w:rPr>
-            </w:pPr>
-            <w:r>
-              <w:rPr>
-                <w:highlight w:val="yellow"/>
-              </w:rPr>
+              <w:rPr/>
+            </w:pPr>
+            <w:r>
+              <w:rPr/>
               <w:t>RF – 02</w:t>
             </w:r>
           </w:p>
@@ -13752,14 +13697,10 @@
           <w:p>
             <w:pPr>
               <w:cnfStyle w:val="000000000000" w:firstRow="0" w:lastRow="0" w:firstColumn="0" w:lastColumn="0" w:oddVBand="0" w:evenVBand="0" w:oddHBand="0" w:evenHBand="0" w:firstRowFirstColumn="0" w:firstRowLastColumn="0" w:lastRowFirstColumn="0" w:lastRowLastColumn="0"/>
-              <w:rPr>
-                <w:highlight w:val="yellow"/>
-              </w:rPr>
-            </w:pPr>
-            <w:r>
-              <w:rPr>
-                <w:highlight w:val="yellow"/>
-              </w:rPr>
+              <w:rPr/>
+            </w:pPr>
+            <w:r>
+              <w:rPr/>
               <w:t>El sistema debe procesar peticiones de conversión, y retornar el cálculo matemático correspondiente.</w:t>
             </w:r>
           </w:p>
@@ -13771,14 +13712,10 @@
           <w:p>
             <w:pPr>
               <w:cnfStyle w:val="000000000000" w:firstRow="0" w:lastRow="0" w:firstColumn="0" w:lastColumn="0" w:oddVBand="0" w:evenVBand="0" w:oddHBand="0" w:evenHBand="0" w:firstRowFirstColumn="0" w:firstRowLastColumn="0" w:lastRowFirstColumn="0" w:lastRowLastColumn="0"/>
-              <w:rPr>
-                <w:highlight w:val="yellow"/>
-              </w:rPr>
-            </w:pPr>
-            <w:r>
-              <w:rPr>
-                <w:highlight w:val="yellow"/>
-              </w:rPr>
+              <w:rPr/>
+            </w:pPr>
+            <w:r>
+              <w:rPr/>
               <w:t>Convertir Longitud</w:t>
             </w:r>
           </w:p>
@@ -13790,14 +13727,10 @@
           <w:p>
             <w:pPr>
               <w:cnfStyle w:val="000000000000" w:firstRow="0" w:lastRow="0" w:firstColumn="0" w:lastColumn="0" w:oddVBand="0" w:evenVBand="0" w:oddHBand="0" w:evenHBand="0" w:firstRowFirstColumn="0" w:firstRowLastColumn="0" w:lastRowFirstColumn="0" w:lastRowLastColumn="0"/>
-              <w:rPr>
-                <w:highlight w:val="yellow"/>
-              </w:rPr>
-            </w:pPr>
-            <w:r>
-              <w:rPr>
-                <w:highlight w:val="yellow"/>
-              </w:rPr>
+              <w:rPr/>
+            </w:pPr>
+            <w:r>
+              <w:rPr/>
               <w:t>Usuario final</w:t>
             </w:r>
           </w:p>
@@ -13814,14 +13747,10 @@
           </w:tcPr>
           <w:p>
             <w:pPr>
-              <w:rPr>
-                <w:highlight w:val="yellow"/>
-              </w:rPr>
-            </w:pPr>
-            <w:r>
-              <w:rPr>
-                <w:highlight w:val="yellow"/>
-              </w:rPr>
+              <w:rPr/>
+            </w:pPr>
+            <w:r>
+              <w:rPr/>
               <w:t>RF – 03</w:t>
             </w:r>
           </w:p>
@@ -13833,14 +13762,10 @@
           <w:p>
             <w:pPr>
               <w:cnfStyle w:val="000000100000" w:firstRow="0" w:lastRow="0" w:firstColumn="0" w:lastColumn="0" w:oddVBand="0" w:evenVBand="0" w:oddHBand="1" w:evenHBand="0" w:firstRowFirstColumn="0" w:firstRowLastColumn="0" w:lastRowFirstColumn="0" w:lastRowLastColumn="0"/>
-              <w:rPr>
-                <w:highlight w:val="yellow"/>
-              </w:rPr>
-            </w:pPr>
-            <w:r>
-              <w:rPr>
-                <w:highlight w:val="yellow"/>
-              </w:rPr>
+              <w:rPr/>
+            </w:pPr>
+            <w:r>
+              <w:rPr/>
               <w:t>El sistema debe procesar peticiones de conversión de unidades de masa, validando previamente el token de acceso, y retornar la respuesta estructurada con el valor resultante.</w:t>
             </w:r>
           </w:p>
@@ -13852,14 +13777,10 @@
           <w:p>
             <w:pPr>
               <w:cnfStyle w:val="000000100000" w:firstRow="0" w:lastRow="0" w:firstColumn="0" w:lastColumn="0" w:oddVBand="0" w:evenVBand="0" w:oddHBand="1" w:evenHBand="0" w:firstRowFirstColumn="0" w:firstRowLastColumn="0" w:lastRowFirstColumn="0" w:lastRowLastColumn="0"/>
-              <w:rPr>
-                <w:highlight w:val="yellow"/>
-              </w:rPr>
-            </w:pPr>
-            <w:r>
-              <w:rPr>
-                <w:highlight w:val="yellow"/>
-              </w:rPr>
+              <w:rPr/>
+            </w:pPr>
+            <w:r>
+              <w:rPr/>
               <w:t>Convertir Masa</w:t>
             </w:r>
           </w:p>
@@ -13871,14 +13792,10 @@
           <w:p>
             <w:pPr>
               <w:cnfStyle w:val="000000100000" w:firstRow="0" w:lastRow="0" w:firstColumn="0" w:lastColumn="0" w:oddVBand="0" w:evenVBand="0" w:oddHBand="1" w:evenHBand="0" w:firstRowFirstColumn="0" w:firstRowLastColumn="0" w:lastRowFirstColumn="0" w:lastRowLastColumn="0"/>
-              <w:rPr>
-                <w:highlight w:val="yellow"/>
-              </w:rPr>
-            </w:pPr>
-            <w:r>
-              <w:rPr>
-                <w:highlight w:val="yellow"/>
-              </w:rPr>
+              <w:rPr/>
+            </w:pPr>
+            <w:r>
+              <w:rPr/>
               <w:t>Usuario final</w:t>
             </w:r>
           </w:p>
@@ -13892,14 +13809,10 @@
           </w:tcPr>
           <w:p>
             <w:pPr>
-              <w:rPr>
-                <w:highlight w:val="yellow"/>
-              </w:rPr>
-            </w:pPr>
-            <w:r>
-              <w:rPr>
-                <w:highlight w:val="yellow"/>
-              </w:rPr>
+              <w:rPr/>
+            </w:pPr>
+            <w:r>
+              <w:rPr/>
               <w:t xml:space="preserve">RF – 04 </w:t>
             </w:r>
           </w:p>
@@ -13911,14 +13824,10 @@
           <w:p>
             <w:pPr>
               <w:cnfStyle w:val="000000000000" w:firstRow="0" w:lastRow="0" w:firstColumn="0" w:lastColumn="0" w:oddVBand="0" w:evenVBand="0" w:oddHBand="0" w:evenHBand="0" w:firstRowFirstColumn="0" w:firstRowLastColumn="0" w:lastRowFirstColumn="0" w:lastRowLastColumn="0"/>
-              <w:rPr>
-                <w:highlight w:val="yellow"/>
-              </w:rPr>
-            </w:pPr>
-            <w:r>
-              <w:rPr>
-                <w:highlight w:val="yellow"/>
-              </w:rPr>
+              <w:rPr/>
+            </w:pPr>
+            <w:r>
+              <w:rPr/>
               <w:t>El sistema debe calcular conversiones entre escalas de temperatura mediante los parámetros enviados, verificando la autorización y retornando el estado de la operación.</w:t>
             </w:r>
           </w:p>
@@ -13930,14 +13839,10 @@
           <w:p>
             <w:pPr>
               <w:cnfStyle w:val="000000000000" w:firstRow="0" w:lastRow="0" w:firstColumn="0" w:lastColumn="0" w:oddVBand="0" w:evenVBand="0" w:oddHBand="0" w:evenHBand="0" w:firstRowFirstColumn="0" w:firstRowLastColumn="0" w:lastRowFirstColumn="0" w:lastRowLastColumn="0"/>
-              <w:rPr>
-                <w:highlight w:val="yellow"/>
-              </w:rPr>
-            </w:pPr>
-            <w:r>
-              <w:rPr>
-                <w:highlight w:val="yellow"/>
-              </w:rPr>
+              <w:rPr/>
+            </w:pPr>
+            <w:r>
+              <w:rPr/>
               <w:t>Convertir Temperatura</w:t>
             </w:r>
           </w:p>
@@ -13951,9 +13856,7 @@
               <w:cnfStyle w:val="000000000000" w:firstRow="0" w:lastRow="0" w:firstColumn="0" w:lastColumn="0" w:oddVBand="0" w:evenVBand="0" w:oddHBand="0" w:evenHBand="0" w:firstRowFirstColumn="0" w:firstRowLastColumn="0" w:lastRowFirstColumn="0" w:lastRowLastColumn="0"/>
             </w:pPr>
             <w:r>
-              <w:rPr>
-                <w:highlight w:val="yellow"/>
-              </w:rPr>
+              <w:rPr/>
               <w:t>Usuario final</w:t>
             </w:r>
             <w:r>
@@ -14420,7 +14323,7 @@
       <w:pPr>
         <w:pStyle w:val="Descripcin"/>
         <w:rPr>
-          <w:rFonts w:ascii="Verdana" w:hAnsi="Verdana" w:cstheme="minorHAnsi"/>
+          <w:rFonts w:ascii="Calibri" w:hAnsi="Calibri" w:cstheme="minorHAnsi"/>
         </w:rPr>
       </w:pPr>
       <w:bookmarkStart w:id="68" w:name="_Toc83812963"/>
@@ -14455,7 +14358,7 @@
     </w:p>
     <w:tbl>
       <w:tblPr>
-        <w:tblStyle w:val="Tablaconcuadrcula5oscura-nfasis4"/>
+        <w:tblStyle w:val="Tablaconcuadrcula4-nfasis1"/>
         <w:tblW w:w="4813" w:type="pct"/>
         <w:tblLook w:val="04A0" w:firstRow="1" w:lastRow="0" w:firstColumn="1" w:lastColumn="0" w:noHBand="0" w:noVBand="1"/>
       </w:tblPr>
@@ -14477,14 +14380,12 @@
               <w:pStyle w:val="Standard"/>
               <w:jc w:val="both"/>
               <w:rPr>
-                <w:rFonts w:ascii="Verdana" w:hAnsi="Verdana" w:cstheme="minorHAnsi"/>
-                <w:highlight w:val="yellow"/>
-              </w:rPr>
-            </w:pPr>
-            <w:r>
-              <w:rPr>
-                <w:rFonts w:ascii="Verdana" w:hAnsi="Verdana" w:cstheme="minorHAnsi"/>
-                <w:highlight w:val="yellow"/>
+                <w:rFonts w:ascii="Calibri" w:hAnsi="Calibri" w:cstheme="minorHAnsi"/>
+              </w:rPr>
+            </w:pPr>
+            <w:r>
+              <w:rPr>
+                <w:rFonts w:ascii="Calibri" w:hAnsi="Calibri" w:cstheme="minorHAnsi"/>
               </w:rPr>
               <w:t>RQF-002</w:t>
             </w:r>
@@ -14500,14 +14401,12 @@
               <w:jc w:val="both"/>
               <w:cnfStyle w:val="100000000000" w:firstRow="1" w:lastRow="0" w:firstColumn="0" w:lastColumn="0" w:oddVBand="0" w:evenVBand="0" w:oddHBand="0" w:evenHBand="0" w:firstRowFirstColumn="0" w:firstRowLastColumn="0" w:lastRowFirstColumn="0" w:lastRowLastColumn="0"/>
               <w:rPr>
-                <w:rFonts w:ascii="Verdana" w:hAnsi="Verdana" w:cstheme="minorHAnsi"/>
-                <w:highlight w:val="yellow"/>
-              </w:rPr>
-            </w:pPr>
-            <w:r>
-              <w:rPr>
-                <w:rFonts w:ascii="Verdana" w:hAnsi="Verdana" w:cstheme="minorHAnsi"/>
-                <w:highlight w:val="yellow"/>
+                <w:rFonts w:ascii="Calibri" w:hAnsi="Calibri" w:cstheme="minorHAnsi"/>
+              </w:rPr>
+            </w:pPr>
+            <w:r>
+              <w:rPr>
+                <w:rFonts w:ascii="Calibri" w:hAnsi="Calibri" w:cstheme="minorHAnsi"/>
                 <w:lang w:val="es-ES"/>
               </w:rPr>
               <w:t>Convertir Longitud</w:t>
@@ -14529,14 +14428,12 @@
               <w:pStyle w:val="Standard"/>
               <w:jc w:val="both"/>
               <w:rPr>
-                <w:rFonts w:ascii="Verdana" w:hAnsi="Verdana" w:cstheme="minorHAnsi"/>
-                <w:highlight w:val="yellow"/>
-              </w:rPr>
-            </w:pPr>
-            <w:r>
-              <w:rPr>
-                <w:rFonts w:ascii="Verdana" w:hAnsi="Verdana" w:cstheme="minorHAnsi"/>
-                <w:highlight w:val="yellow"/>
+                <w:rFonts w:ascii="Calibri" w:hAnsi="Calibri" w:cstheme="minorHAnsi"/>
+              </w:rPr>
+            </w:pPr>
+            <w:r>
+              <w:rPr>
+                <w:rFonts w:ascii="Calibri" w:hAnsi="Calibri" w:cstheme="minorHAnsi"/>
               </w:rPr>
               <w:t>Descripción</w:t>
             </w:r>
@@ -14552,14 +14449,12 @@
               <w:jc w:val="both"/>
               <w:cnfStyle w:val="000000100000" w:firstRow="0" w:lastRow="0" w:firstColumn="0" w:lastColumn="0" w:oddVBand="0" w:evenVBand="0" w:oddHBand="1" w:evenHBand="0" w:firstRowFirstColumn="0" w:firstRowLastColumn="0" w:lastRowFirstColumn="0" w:lastRowLastColumn="0"/>
               <w:rPr>
-                <w:rFonts w:ascii="Verdana" w:hAnsi="Verdana" w:cstheme="minorHAnsi"/>
-                <w:highlight w:val="yellow"/>
-              </w:rPr>
-            </w:pPr>
-            <w:r>
-              <w:rPr>
-                <w:rFonts w:ascii="Verdana" w:hAnsi="Verdana" w:cstheme="minorHAnsi"/>
-                <w:highlight w:val="yellow"/>
+                <w:rFonts w:ascii="Calibri" w:hAnsi="Calibri" w:cstheme="minorHAnsi"/>
+              </w:rPr>
+            </w:pPr>
+            <w:r>
+              <w:rPr>
+                <w:rFonts w:ascii="Calibri" w:hAnsi="Calibri" w:cstheme="minorHAnsi"/>
                 <w:lang w:val="es-ES"/>
               </w:rPr>
               <w:t>El sistema debe procesar peticiones de conversión de longitud, y retornar el cálculo matemático correspondiente.</w:t>
@@ -14578,14 +14473,12 @@
               <w:pStyle w:val="Standard"/>
               <w:jc w:val="both"/>
               <w:rPr>
-                <w:rFonts w:ascii="Verdana" w:hAnsi="Verdana" w:cstheme="minorHAnsi"/>
-                <w:highlight w:val="yellow"/>
-              </w:rPr>
-            </w:pPr>
-            <w:r>
-              <w:rPr>
-                <w:rFonts w:ascii="Verdana" w:hAnsi="Verdana" w:cstheme="minorHAnsi"/>
-                <w:highlight w:val="yellow"/>
+                <w:rFonts w:ascii="Calibri" w:hAnsi="Calibri" w:cstheme="minorHAnsi"/>
+              </w:rPr>
+            </w:pPr>
+            <w:r>
+              <w:rPr>
+                <w:rFonts w:ascii="Calibri" w:hAnsi="Calibri" w:cstheme="minorHAnsi"/>
               </w:rPr>
               <w:t>Objetivo</w:t>
             </w:r>
@@ -14601,14 +14494,12 @@
               <w:jc w:val="both"/>
               <w:cnfStyle w:val="000000000000" w:firstRow="0" w:lastRow="0" w:firstColumn="0" w:lastColumn="0" w:oddVBand="0" w:evenVBand="0" w:oddHBand="0" w:evenHBand="0" w:firstRowFirstColumn="0" w:firstRowLastColumn="0" w:lastRowFirstColumn="0" w:lastRowLastColumn="0"/>
               <w:rPr>
-                <w:rFonts w:ascii="Verdana" w:hAnsi="Verdana" w:cstheme="minorHAnsi"/>
-                <w:highlight w:val="yellow"/>
-              </w:rPr>
-            </w:pPr>
-            <w:r>
-              <w:rPr>
-                <w:rFonts w:ascii="Verdana" w:hAnsi="Verdana" w:cstheme="minorHAnsi"/>
-                <w:highlight w:val="yellow"/>
+                <w:rFonts w:ascii="Calibri" w:hAnsi="Calibri" w:cstheme="minorHAnsi"/>
+              </w:rPr>
+            </w:pPr>
+            <w:r>
+              <w:rPr>
+                <w:rFonts w:ascii="Calibri" w:hAnsi="Calibri" w:cstheme="minorHAnsi"/>
               </w:rPr>
               <w:t>OBJ-001</w:t>
             </w:r>
@@ -14629,14 +14520,12 @@
               <w:pStyle w:val="Standard"/>
               <w:jc w:val="both"/>
               <w:rPr>
-                <w:rFonts w:ascii="Verdana" w:hAnsi="Verdana" w:cstheme="minorHAnsi"/>
-                <w:highlight w:val="yellow"/>
-              </w:rPr>
-            </w:pPr>
-            <w:r>
-              <w:rPr>
-                <w:rFonts w:ascii="Verdana" w:hAnsi="Verdana" w:cstheme="minorHAnsi"/>
-                <w:highlight w:val="yellow"/>
+                <w:rFonts w:ascii="Calibri" w:hAnsi="Calibri" w:cstheme="minorHAnsi"/>
+              </w:rPr>
+            </w:pPr>
+            <w:r>
+              <w:rPr>
+                <w:rFonts w:ascii="Calibri" w:hAnsi="Calibri" w:cstheme="minorHAnsi"/>
               </w:rPr>
               <w:t>Importancia</w:t>
             </w:r>
@@ -14652,14 +14541,12 @@
               <w:jc w:val="both"/>
               <w:cnfStyle w:val="000000100000" w:firstRow="0" w:lastRow="0" w:firstColumn="0" w:lastColumn="0" w:oddVBand="0" w:evenVBand="0" w:oddHBand="1" w:evenHBand="0" w:firstRowFirstColumn="0" w:firstRowLastColumn="0" w:lastRowFirstColumn="0" w:lastRowLastColumn="0"/>
               <w:rPr>
-                <w:rFonts w:ascii="Verdana" w:hAnsi="Verdana" w:cstheme="minorHAnsi"/>
-                <w:highlight w:val="yellow"/>
-              </w:rPr>
-            </w:pPr>
-            <w:r>
-              <w:rPr>
-                <w:rFonts w:ascii="Verdana" w:hAnsi="Verdana" w:cstheme="minorHAnsi"/>
-                <w:highlight w:val="yellow"/>
+                <w:rFonts w:ascii="Calibri" w:hAnsi="Calibri" w:cstheme="minorHAnsi"/>
+              </w:rPr>
+            </w:pPr>
+            <w:r>
+              <w:rPr>
+                <w:rFonts w:ascii="Calibri" w:hAnsi="Calibri" w:cstheme="minorHAnsi"/>
               </w:rPr>
               <w:t>Alta</w:t>
             </w:r>
@@ -14677,14 +14564,12 @@
               <w:pStyle w:val="Standard"/>
               <w:jc w:val="both"/>
               <w:rPr>
-                <w:rFonts w:ascii="Verdana" w:hAnsi="Verdana" w:cstheme="minorHAnsi"/>
-                <w:highlight w:val="yellow"/>
-              </w:rPr>
-            </w:pPr>
-            <w:r>
-              <w:rPr>
-                <w:rFonts w:ascii="Verdana" w:hAnsi="Verdana" w:cstheme="minorHAnsi"/>
-                <w:highlight w:val="yellow"/>
+                <w:rFonts w:ascii="Calibri" w:hAnsi="Calibri" w:cstheme="minorHAnsi"/>
+              </w:rPr>
+            </w:pPr>
+            <w:r>
+              <w:rPr>
+                <w:rFonts w:ascii="Calibri" w:hAnsi="Calibri" w:cstheme="minorHAnsi"/>
               </w:rPr>
               <w:t>Estado</w:t>
             </w:r>
@@ -14700,14 +14585,12 @@
               <w:jc w:val="both"/>
               <w:cnfStyle w:val="000000000000" w:firstRow="0" w:lastRow="0" w:firstColumn="0" w:lastColumn="0" w:oddVBand="0" w:evenVBand="0" w:oddHBand="0" w:evenHBand="0" w:firstRowFirstColumn="0" w:firstRowLastColumn="0" w:lastRowFirstColumn="0" w:lastRowLastColumn="0"/>
               <w:rPr>
-                <w:rFonts w:ascii="Verdana" w:hAnsi="Verdana" w:cstheme="minorHAnsi"/>
-                <w:highlight w:val="yellow"/>
-              </w:rPr>
-            </w:pPr>
-            <w:r>
-              <w:rPr>
-                <w:rFonts w:ascii="Verdana" w:hAnsi="Verdana" w:cstheme="minorHAnsi"/>
-                <w:highlight w:val="yellow"/>
+                <w:rFonts w:ascii="Calibri" w:hAnsi="Calibri" w:cstheme="minorHAnsi"/>
+              </w:rPr>
+            </w:pPr>
+            <w:r>
+              <w:rPr>
+                <w:rFonts w:ascii="Calibri" w:hAnsi="Calibri" w:cstheme="minorHAnsi"/>
               </w:rPr>
               <w:t>Aprobado</w:t>
             </w:r>
@@ -14728,14 +14611,12 @@
               <w:pStyle w:val="Standard"/>
               <w:jc w:val="both"/>
               <w:rPr>
-                <w:rFonts w:ascii="Verdana" w:hAnsi="Verdana" w:cstheme="minorHAnsi"/>
-                <w:highlight w:val="yellow"/>
-              </w:rPr>
-            </w:pPr>
-            <w:r>
-              <w:rPr>
-                <w:rFonts w:ascii="Verdana" w:hAnsi="Verdana" w:cstheme="minorHAnsi"/>
-                <w:highlight w:val="yellow"/>
+                <w:rFonts w:ascii="Calibri" w:hAnsi="Calibri" w:cstheme="minorHAnsi"/>
+              </w:rPr>
+            </w:pPr>
+            <w:r>
+              <w:rPr>
+                <w:rFonts w:ascii="Calibri" w:hAnsi="Calibri" w:cstheme="minorHAnsi"/>
               </w:rPr>
               <w:t>Estabilidad</w:t>
             </w:r>
@@ -14751,14 +14632,12 @@
               <w:jc w:val="both"/>
               <w:cnfStyle w:val="000000100000" w:firstRow="0" w:lastRow="0" w:firstColumn="0" w:lastColumn="0" w:oddVBand="0" w:evenVBand="0" w:oddHBand="1" w:evenHBand="0" w:firstRowFirstColumn="0" w:firstRowLastColumn="0" w:lastRowFirstColumn="0" w:lastRowLastColumn="0"/>
               <w:rPr>
-                <w:rFonts w:ascii="Verdana" w:hAnsi="Verdana" w:cstheme="minorHAnsi"/>
-                <w:highlight w:val="yellow"/>
-              </w:rPr>
-            </w:pPr>
-            <w:r>
-              <w:rPr>
-                <w:rFonts w:ascii="Verdana" w:hAnsi="Verdana" w:cstheme="minorHAnsi"/>
-                <w:highlight w:val="yellow"/>
+                <w:rFonts w:ascii="Calibri" w:hAnsi="Calibri" w:cstheme="minorHAnsi"/>
+              </w:rPr>
+            </w:pPr>
+            <w:r>
+              <w:rPr>
+                <w:rFonts w:ascii="Calibri" w:hAnsi="Calibri" w:cstheme="minorHAnsi"/>
               </w:rPr>
               <w:t>Alta</w:t>
             </w:r>
@@ -14776,14 +14655,12 @@
               <w:pStyle w:val="Standard"/>
               <w:jc w:val="both"/>
               <w:rPr>
-                <w:rFonts w:ascii="Verdana" w:hAnsi="Verdana" w:cstheme="minorHAnsi"/>
-                <w:highlight w:val="yellow"/>
-              </w:rPr>
-            </w:pPr>
-            <w:r>
-              <w:rPr>
-                <w:rFonts w:ascii="Verdana" w:hAnsi="Verdana" w:cstheme="minorHAnsi"/>
-                <w:highlight w:val="yellow"/>
+                <w:rFonts w:ascii="Calibri" w:hAnsi="Calibri" w:cstheme="minorHAnsi"/>
+              </w:rPr>
+            </w:pPr>
+            <w:r>
+              <w:rPr>
+                <w:rFonts w:ascii="Calibri" w:hAnsi="Calibri" w:cstheme="minorHAnsi"/>
               </w:rPr>
               <w:t>Comentarios</w:t>
             </w:r>
@@ -14798,28 +14675,24 @@
               <w:pStyle w:val="Standard"/>
               <w:cnfStyle w:val="000000000000" w:firstRow="0" w:lastRow="0" w:firstColumn="0" w:lastColumn="0" w:oddVBand="0" w:evenVBand="0" w:oddHBand="0" w:evenHBand="0" w:firstRowFirstColumn="0" w:firstRowLastColumn="0" w:lastRowFirstColumn="0" w:lastRowLastColumn="0"/>
               <w:rPr>
-                <w:rFonts w:ascii="Verdana" w:hAnsi="Verdana" w:cstheme="minorHAnsi"/>
-                <w:highlight w:val="yellow"/>
-              </w:rPr>
-            </w:pPr>
-            <w:r>
-              <w:rPr>
-                <w:rFonts w:ascii="Verdana" w:hAnsi="Verdana" w:cstheme="minorHAnsi"/>
-                <w:highlight w:val="yellow"/>
+                <w:rFonts w:ascii="Calibri" w:hAnsi="Calibri" w:cstheme="minorHAnsi"/>
+              </w:rPr>
+            </w:pPr>
+            <w:r>
+              <w:rPr>
+                <w:rFonts w:ascii="Calibri" w:hAnsi="Calibri" w:cstheme="minorHAnsi"/>
               </w:rPr>
               <w:t>Las unidades disponibles para la conversión son:</w:t>
             </w:r>
             <w:r>
               <w:rPr>
-                <w:rFonts w:ascii="Verdana" w:hAnsi="Verdana" w:cstheme="minorHAnsi"/>
-                <w:highlight w:val="yellow"/>
+                <w:rFonts w:ascii="Calibri" w:hAnsi="Calibri" w:cstheme="minorHAnsi"/>
               </w:rPr>
               <w:t xml:space="preserve"> </w:t>
             </w:r>
             <w:r>
               <w:rPr>
-                <w:rFonts w:ascii="Verdana" w:hAnsi="Verdana" w:cstheme="minorHAnsi"/>
-                <w:highlight w:val="yellow"/>
+                <w:rFonts w:ascii="Calibri" w:hAnsi="Calibri" w:cstheme="minorHAnsi"/>
               </w:rPr>
               <w:t>metros, pies, centímetros, yardas y millas</w:t>
             </w:r>
@@ -14831,65 +14704,49 @@
       <w:pPr>
         <w:pStyle w:val="Descripcin"/>
         <w:rPr>
-          <w:rFonts w:ascii="Verdana" w:hAnsi="Verdana" w:cstheme="minorHAnsi"/>
-          <w:highlight w:val="yellow"/>
+          <w:rFonts w:ascii="Calibri" w:hAnsi="Calibri" w:cstheme="minorHAnsi"/>
         </w:rPr>
       </w:pPr>
       <w:bookmarkStart w:id="69" w:name="_Toc83812964"/>
       <w:r>
-        <w:rPr>
-          <w:highlight w:val="yellow"/>
-        </w:rPr>
+        <w:rPr/>
         <w:t xml:space="preserve">Tabla </w:t>
       </w:r>
       <w:r>
-        <w:rPr>
-          <w:highlight w:val="yellow"/>
-        </w:rPr>
+        <w:rPr/>
         <w:fldChar w:fldCharType="begin"/>
       </w:r>
       <w:r>
-        <w:rPr>
-          <w:highlight w:val="yellow"/>
-        </w:rPr>
+        <w:rPr/>
         <w:instrText xml:space="preserve"> SEQ Tabla \* ARABIC </w:instrText>
       </w:r>
       <w:r>
-        <w:rPr>
-          <w:highlight w:val="yellow"/>
-        </w:rPr>
+        <w:rPr/>
         <w:fldChar w:fldCharType="separate"/>
       </w:r>
       <w:r>
         <w:rPr>
           <w:noProof/>
-          <w:highlight w:val="yellow"/>
         </w:rPr>
         <w:t>21</w:t>
       </w:r>
       <w:r>
-        <w:rPr>
-          <w:highlight w:val="yellow"/>
-        </w:rPr>
+        <w:rPr/>
         <w:fldChar w:fldCharType="end"/>
       </w:r>
       <w:r>
-        <w:rPr>
-          <w:highlight w:val="yellow"/>
-        </w:rPr>
+        <w:rPr/>
         <w:t>.</w:t>
       </w:r>
       <w:bookmarkEnd w:id="69"/>
       <w:r>
-        <w:rPr>
-          <w:highlight w:val="yellow"/>
-        </w:rPr>
+        <w:rPr/>
         <w:t xml:space="preserve"> Convertir Masa</w:t>
       </w:r>
     </w:p>
     <w:tbl>
       <w:tblPr>
-        <w:tblStyle w:val="Tablaconcuadrcula5oscura-nfasis4"/>
+        <w:tblStyle w:val="Tablaconcuadrcula4-nfasis1"/>
         <w:tblW w:w="0" w:type="auto"/>
         <w:tblLook w:val="04A0" w:firstRow="1" w:lastRow="0" w:firstColumn="1" w:lastColumn="0" w:noHBand="0" w:noVBand="1"/>
       </w:tblPr>
@@ -14911,14 +14768,12 @@
               <w:pStyle w:val="Standard"/>
               <w:jc w:val="both"/>
               <w:rPr>
-                <w:rFonts w:ascii="Verdana" w:hAnsi="Verdana" w:cstheme="minorHAnsi"/>
-                <w:highlight w:val="yellow"/>
-              </w:rPr>
-            </w:pPr>
-            <w:r>
-              <w:rPr>
-                <w:rFonts w:ascii="Verdana" w:hAnsi="Verdana" w:cstheme="minorHAnsi"/>
-                <w:highlight w:val="yellow"/>
+                <w:rFonts w:ascii="Calibri" w:hAnsi="Calibri" w:cstheme="minorHAnsi"/>
+              </w:rPr>
+            </w:pPr>
+            <w:r>
+              <w:rPr>
+                <w:rFonts w:ascii="Calibri" w:hAnsi="Calibri" w:cstheme="minorHAnsi"/>
               </w:rPr>
               <w:t>RQF-003</w:t>
             </w:r>
@@ -14934,14 +14789,12 @@
               <w:jc w:val="both"/>
               <w:cnfStyle w:val="100000000000" w:firstRow="1" w:lastRow="0" w:firstColumn="0" w:lastColumn="0" w:oddVBand="0" w:evenVBand="0" w:oddHBand="0" w:evenHBand="0" w:firstRowFirstColumn="0" w:firstRowLastColumn="0" w:lastRowFirstColumn="0" w:lastRowLastColumn="0"/>
               <w:rPr>
-                <w:rFonts w:ascii="Verdana" w:hAnsi="Verdana" w:cstheme="minorHAnsi"/>
-                <w:highlight w:val="yellow"/>
-              </w:rPr>
-            </w:pPr>
-            <w:r>
-              <w:rPr>
-                <w:rFonts w:ascii="Verdana" w:hAnsi="Verdana" w:cstheme="minorHAnsi"/>
-                <w:highlight w:val="yellow"/>
+                <w:rFonts w:ascii="Calibri" w:hAnsi="Calibri" w:cstheme="minorHAnsi"/>
+              </w:rPr>
+            </w:pPr>
+            <w:r>
+              <w:rPr>
+                <w:rFonts w:ascii="Calibri" w:hAnsi="Calibri" w:cstheme="minorHAnsi"/>
                 <w:lang w:val="es-ES"/>
               </w:rPr>
               <w:t>Convertir Masa</w:t>
@@ -14963,14 +14816,12 @@
               <w:pStyle w:val="Standard"/>
               <w:jc w:val="both"/>
               <w:rPr>
-                <w:rFonts w:ascii="Verdana" w:hAnsi="Verdana" w:cstheme="minorHAnsi"/>
-                <w:highlight w:val="yellow"/>
-              </w:rPr>
-            </w:pPr>
-            <w:r>
-              <w:rPr>
-                <w:rFonts w:ascii="Verdana" w:hAnsi="Verdana" w:cstheme="minorHAnsi"/>
-                <w:highlight w:val="yellow"/>
+                <w:rFonts w:ascii="Calibri" w:hAnsi="Calibri" w:cstheme="minorHAnsi"/>
+              </w:rPr>
+            </w:pPr>
+            <w:r>
+              <w:rPr>
+                <w:rFonts w:ascii="Calibri" w:hAnsi="Calibri" w:cstheme="minorHAnsi"/>
               </w:rPr>
               <w:t>Descripción</w:t>
             </w:r>
@@ -14986,14 +14837,12 @@
               <w:jc w:val="both"/>
               <w:cnfStyle w:val="000000100000" w:firstRow="0" w:lastRow="0" w:firstColumn="0" w:lastColumn="0" w:oddVBand="0" w:evenVBand="0" w:oddHBand="1" w:evenHBand="0" w:firstRowFirstColumn="0" w:firstRowLastColumn="0" w:lastRowFirstColumn="0" w:lastRowLastColumn="0"/>
               <w:rPr>
-                <w:rFonts w:ascii="Verdana" w:hAnsi="Verdana" w:cstheme="minorHAnsi"/>
-                <w:highlight w:val="yellow"/>
-              </w:rPr>
-            </w:pPr>
-            <w:r>
-              <w:rPr>
-                <w:rFonts w:ascii="Verdana" w:hAnsi="Verdana" w:cstheme="minorHAnsi"/>
-                <w:highlight w:val="yellow"/>
+                <w:rFonts w:ascii="Calibri" w:hAnsi="Calibri" w:cstheme="minorHAnsi"/>
+              </w:rPr>
+            </w:pPr>
+            <w:r>
+              <w:rPr>
+                <w:rFonts w:ascii="Calibri" w:hAnsi="Calibri" w:cstheme="minorHAnsi"/>
                 <w:lang w:val="es-ES"/>
               </w:rPr>
               <w:t>El sistema debe procesar peticiones de conversión de masa, y retornar el cálculo matemático correspondiente.</w:t>
@@ -15012,14 +14861,12 @@
               <w:pStyle w:val="Standard"/>
               <w:jc w:val="both"/>
               <w:rPr>
-                <w:rFonts w:ascii="Verdana" w:hAnsi="Verdana" w:cstheme="minorHAnsi"/>
-                <w:highlight w:val="yellow"/>
-              </w:rPr>
-            </w:pPr>
-            <w:r>
-              <w:rPr>
-                <w:rFonts w:ascii="Verdana" w:hAnsi="Verdana" w:cstheme="minorHAnsi"/>
-                <w:highlight w:val="yellow"/>
+                <w:rFonts w:ascii="Calibri" w:hAnsi="Calibri" w:cstheme="minorHAnsi"/>
+              </w:rPr>
+            </w:pPr>
+            <w:r>
+              <w:rPr>
+                <w:rFonts w:ascii="Calibri" w:hAnsi="Calibri" w:cstheme="minorHAnsi"/>
               </w:rPr>
               <w:t>Objetivo</w:t>
             </w:r>
@@ -15035,14 +14882,12 @@
               <w:jc w:val="both"/>
               <w:cnfStyle w:val="000000000000" w:firstRow="0" w:lastRow="0" w:firstColumn="0" w:lastColumn="0" w:oddVBand="0" w:evenVBand="0" w:oddHBand="0" w:evenHBand="0" w:firstRowFirstColumn="0" w:firstRowLastColumn="0" w:lastRowFirstColumn="0" w:lastRowLastColumn="0"/>
               <w:rPr>
-                <w:rFonts w:ascii="Verdana" w:hAnsi="Verdana" w:cstheme="minorHAnsi"/>
-                <w:highlight w:val="yellow"/>
-              </w:rPr>
-            </w:pPr>
-            <w:r>
-              <w:rPr>
-                <w:rFonts w:ascii="Verdana" w:hAnsi="Verdana" w:cstheme="minorHAnsi"/>
-                <w:highlight w:val="yellow"/>
+                <w:rFonts w:ascii="Calibri" w:hAnsi="Calibri" w:cstheme="minorHAnsi"/>
+              </w:rPr>
+            </w:pPr>
+            <w:r>
+              <w:rPr>
+                <w:rFonts w:ascii="Calibri" w:hAnsi="Calibri" w:cstheme="minorHAnsi"/>
               </w:rPr>
               <w:t>OBJ-001</w:t>
             </w:r>
@@ -15063,14 +14908,12 @@
               <w:pStyle w:val="Standard"/>
               <w:jc w:val="both"/>
               <w:rPr>
-                <w:rFonts w:ascii="Verdana" w:hAnsi="Verdana" w:cstheme="minorHAnsi"/>
-                <w:highlight w:val="yellow"/>
-              </w:rPr>
-            </w:pPr>
-            <w:r>
-              <w:rPr>
-                <w:rFonts w:ascii="Verdana" w:hAnsi="Verdana" w:cstheme="minorHAnsi"/>
-                <w:highlight w:val="yellow"/>
+                <w:rFonts w:ascii="Calibri" w:hAnsi="Calibri" w:cstheme="minorHAnsi"/>
+              </w:rPr>
+            </w:pPr>
+            <w:r>
+              <w:rPr>
+                <w:rFonts w:ascii="Calibri" w:hAnsi="Calibri" w:cstheme="minorHAnsi"/>
               </w:rPr>
               <w:t>Importancia</w:t>
             </w:r>
@@ -15086,14 +14929,12 @@
               <w:jc w:val="both"/>
               <w:cnfStyle w:val="000000100000" w:firstRow="0" w:lastRow="0" w:firstColumn="0" w:lastColumn="0" w:oddVBand="0" w:evenVBand="0" w:oddHBand="1" w:evenHBand="0" w:firstRowFirstColumn="0" w:firstRowLastColumn="0" w:lastRowFirstColumn="0" w:lastRowLastColumn="0"/>
               <w:rPr>
-                <w:rFonts w:ascii="Verdana" w:hAnsi="Verdana" w:cstheme="minorHAnsi"/>
-                <w:highlight w:val="yellow"/>
-              </w:rPr>
-            </w:pPr>
-            <w:r>
-              <w:rPr>
-                <w:rFonts w:ascii="Verdana" w:hAnsi="Verdana" w:cstheme="minorHAnsi"/>
-                <w:highlight w:val="yellow"/>
+                <w:rFonts w:ascii="Calibri" w:hAnsi="Calibri" w:cstheme="minorHAnsi"/>
+              </w:rPr>
+            </w:pPr>
+            <w:r>
+              <w:rPr>
+                <w:rFonts w:ascii="Calibri" w:hAnsi="Calibri" w:cstheme="minorHAnsi"/>
               </w:rPr>
               <w:t>Alta</w:t>
             </w:r>
@@ -15111,14 +14952,12 @@
               <w:pStyle w:val="Standard"/>
               <w:jc w:val="both"/>
               <w:rPr>
-                <w:rFonts w:ascii="Verdana" w:hAnsi="Verdana" w:cstheme="minorHAnsi"/>
-                <w:highlight w:val="yellow"/>
-              </w:rPr>
-            </w:pPr>
-            <w:r>
-              <w:rPr>
-                <w:rFonts w:ascii="Verdana" w:hAnsi="Verdana" w:cstheme="minorHAnsi"/>
-                <w:highlight w:val="yellow"/>
+                <w:rFonts w:ascii="Calibri" w:hAnsi="Calibri" w:cstheme="minorHAnsi"/>
+              </w:rPr>
+            </w:pPr>
+            <w:r>
+              <w:rPr>
+                <w:rFonts w:ascii="Calibri" w:hAnsi="Calibri" w:cstheme="minorHAnsi"/>
               </w:rPr>
               <w:t>Estado</w:t>
             </w:r>
@@ -15134,14 +14973,12 @@
               <w:jc w:val="both"/>
               <w:cnfStyle w:val="000000000000" w:firstRow="0" w:lastRow="0" w:firstColumn="0" w:lastColumn="0" w:oddVBand="0" w:evenVBand="0" w:oddHBand="0" w:evenHBand="0" w:firstRowFirstColumn="0" w:firstRowLastColumn="0" w:lastRowFirstColumn="0" w:lastRowLastColumn="0"/>
               <w:rPr>
-                <w:rFonts w:ascii="Verdana" w:hAnsi="Verdana" w:cstheme="minorHAnsi"/>
-                <w:highlight w:val="yellow"/>
-              </w:rPr>
-            </w:pPr>
-            <w:r>
-              <w:rPr>
-                <w:rFonts w:ascii="Verdana" w:hAnsi="Verdana" w:cstheme="minorHAnsi"/>
-                <w:highlight w:val="yellow"/>
+                <w:rFonts w:ascii="Calibri" w:hAnsi="Calibri" w:cstheme="minorHAnsi"/>
+              </w:rPr>
+            </w:pPr>
+            <w:r>
+              <w:rPr>
+                <w:rFonts w:ascii="Calibri" w:hAnsi="Calibri" w:cstheme="minorHAnsi"/>
               </w:rPr>
               <w:t>Aprobado</w:t>
             </w:r>
@@ -15162,14 +14999,12 @@
               <w:pStyle w:val="Standard"/>
               <w:jc w:val="both"/>
               <w:rPr>
-                <w:rFonts w:ascii="Verdana" w:hAnsi="Verdana" w:cstheme="minorHAnsi"/>
-                <w:highlight w:val="yellow"/>
-              </w:rPr>
-            </w:pPr>
-            <w:r>
-              <w:rPr>
-                <w:rFonts w:ascii="Verdana" w:hAnsi="Verdana" w:cstheme="minorHAnsi"/>
-                <w:highlight w:val="yellow"/>
+                <w:rFonts w:ascii="Calibri" w:hAnsi="Calibri" w:cstheme="minorHAnsi"/>
+              </w:rPr>
+            </w:pPr>
+            <w:r>
+              <w:rPr>
+                <w:rFonts w:ascii="Calibri" w:hAnsi="Calibri" w:cstheme="minorHAnsi"/>
               </w:rPr>
               <w:t>Estabilidad</w:t>
             </w:r>
@@ -15185,14 +15020,12 @@
               <w:jc w:val="both"/>
               <w:cnfStyle w:val="000000100000" w:firstRow="0" w:lastRow="0" w:firstColumn="0" w:lastColumn="0" w:oddVBand="0" w:evenVBand="0" w:oddHBand="1" w:evenHBand="0" w:firstRowFirstColumn="0" w:firstRowLastColumn="0" w:lastRowFirstColumn="0" w:lastRowLastColumn="0"/>
               <w:rPr>
-                <w:rFonts w:ascii="Verdana" w:hAnsi="Verdana" w:cstheme="minorHAnsi"/>
-                <w:highlight w:val="yellow"/>
-              </w:rPr>
-            </w:pPr>
-            <w:r>
-              <w:rPr>
-                <w:rFonts w:ascii="Verdana" w:hAnsi="Verdana" w:cstheme="minorHAnsi"/>
-                <w:highlight w:val="yellow"/>
+                <w:rFonts w:ascii="Calibri" w:hAnsi="Calibri" w:cstheme="minorHAnsi"/>
+              </w:rPr>
+            </w:pPr>
+            <w:r>
+              <w:rPr>
+                <w:rFonts w:ascii="Calibri" w:hAnsi="Calibri" w:cstheme="minorHAnsi"/>
               </w:rPr>
               <w:t>Alta</w:t>
             </w:r>
@@ -15210,14 +15043,12 @@
               <w:pStyle w:val="Standard"/>
               <w:jc w:val="both"/>
               <w:rPr>
-                <w:rFonts w:ascii="Verdana" w:hAnsi="Verdana" w:cstheme="minorHAnsi"/>
-                <w:highlight w:val="yellow"/>
-              </w:rPr>
-            </w:pPr>
-            <w:r>
-              <w:rPr>
-                <w:rFonts w:ascii="Verdana" w:hAnsi="Verdana" w:cstheme="minorHAnsi"/>
-                <w:highlight w:val="yellow"/>
+                <w:rFonts w:ascii="Calibri" w:hAnsi="Calibri" w:cstheme="minorHAnsi"/>
+              </w:rPr>
+            </w:pPr>
+            <w:r>
+              <w:rPr>
+                <w:rFonts w:ascii="Calibri" w:hAnsi="Calibri" w:cstheme="minorHAnsi"/>
               </w:rPr>
               <w:t>Comentarios</w:t>
             </w:r>
@@ -15232,14 +15063,12 @@
               <w:pStyle w:val="Standard"/>
               <w:cnfStyle w:val="000000000000" w:firstRow="0" w:lastRow="0" w:firstColumn="0" w:lastColumn="0" w:oddVBand="0" w:evenVBand="0" w:oddHBand="0" w:evenHBand="0" w:firstRowFirstColumn="0" w:firstRowLastColumn="0" w:lastRowFirstColumn="0" w:lastRowLastColumn="0"/>
               <w:rPr>
-                <w:rFonts w:ascii="Verdana" w:hAnsi="Verdana" w:cstheme="minorHAnsi"/>
-                <w:highlight w:val="yellow"/>
-              </w:rPr>
-            </w:pPr>
-            <w:r>
-              <w:rPr>
-                <w:rFonts w:ascii="Verdana" w:hAnsi="Verdana" w:cstheme="minorHAnsi"/>
-                <w:highlight w:val="yellow"/>
+                <w:rFonts w:ascii="Calibri" w:hAnsi="Calibri" w:cstheme="minorHAnsi"/>
+              </w:rPr>
+            </w:pPr>
+            <w:r>
+              <w:rPr>
+                <w:rFonts w:ascii="Calibri" w:hAnsi="Calibri" w:cstheme="minorHAnsi"/>
               </w:rPr>
               <w:t xml:space="preserve">Las unidades disponibles para la conversión son: gramos, kilogramos, onzas, libras y quintales. </w:t>
             </w:r>
@@ -15251,65 +15080,49 @@
       <w:pPr>
         <w:pStyle w:val="Descripcin"/>
         <w:rPr>
-          <w:rFonts w:ascii="Verdana" w:hAnsi="Verdana" w:cstheme="minorHAnsi"/>
-          <w:highlight w:val="yellow"/>
+          <w:rFonts w:ascii="Calibri" w:hAnsi="Calibri" w:cstheme="minorHAnsi"/>
         </w:rPr>
       </w:pPr>
       <w:bookmarkStart w:id="70" w:name="_Toc83812965"/>
       <w:r>
-        <w:rPr>
-          <w:highlight w:val="yellow"/>
-        </w:rPr>
+        <w:rPr/>
         <w:t xml:space="preserve">Tabla </w:t>
       </w:r>
       <w:r>
-        <w:rPr>
-          <w:highlight w:val="yellow"/>
-        </w:rPr>
+        <w:rPr/>
         <w:fldChar w:fldCharType="begin"/>
       </w:r>
       <w:r>
-        <w:rPr>
-          <w:highlight w:val="yellow"/>
-        </w:rPr>
+        <w:rPr/>
         <w:instrText xml:space="preserve"> SEQ Tabla \* ARABIC </w:instrText>
       </w:r>
       <w:r>
-        <w:rPr>
-          <w:highlight w:val="yellow"/>
-        </w:rPr>
+        <w:rPr/>
         <w:fldChar w:fldCharType="separate"/>
       </w:r>
       <w:r>
         <w:rPr>
           <w:noProof/>
-          <w:highlight w:val="yellow"/>
         </w:rPr>
         <w:t>22</w:t>
       </w:r>
       <w:r>
-        <w:rPr>
-          <w:highlight w:val="yellow"/>
-        </w:rPr>
+        <w:rPr/>
         <w:fldChar w:fldCharType="end"/>
       </w:r>
       <w:r>
-        <w:rPr>
-          <w:highlight w:val="yellow"/>
-        </w:rPr>
+        <w:rPr/>
         <w:t xml:space="preserve">. </w:t>
       </w:r>
       <w:bookmarkEnd w:id="70"/>
       <w:r>
-        <w:rPr>
-          <w:highlight w:val="yellow"/>
-        </w:rPr>
+        <w:rPr/>
         <w:t>Convertir Temperatura</w:t>
       </w:r>
     </w:p>
     <w:tbl>
       <w:tblPr>
-        <w:tblStyle w:val="Tablaconcuadrcula5oscura-nfasis4"/>
+        <w:tblStyle w:val="Tablaconcuadrcula4-nfasis1"/>
         <w:tblW w:w="9010" w:type="dxa"/>
         <w:tblInd w:w="5" w:type="dxa"/>
         <w:tblLook w:val="04A0" w:firstRow="1" w:lastRow="0" w:firstColumn="1" w:lastColumn="0" w:noHBand="0" w:noVBand="1"/>
@@ -15332,14 +15145,12 @@
               <w:pStyle w:val="Standard"/>
               <w:jc w:val="both"/>
               <w:rPr>
-                <w:rFonts w:ascii="Verdana" w:hAnsi="Verdana" w:cstheme="minorHAnsi"/>
-                <w:highlight w:val="yellow"/>
-              </w:rPr>
-            </w:pPr>
-            <w:r>
-              <w:rPr>
-                <w:rFonts w:ascii="Verdana" w:hAnsi="Verdana" w:cstheme="minorHAnsi"/>
-                <w:highlight w:val="yellow"/>
+                <w:rFonts w:ascii="Calibri" w:hAnsi="Calibri" w:cstheme="minorHAnsi"/>
+              </w:rPr>
+            </w:pPr>
+            <w:r>
+              <w:rPr>
+                <w:rFonts w:ascii="Calibri" w:hAnsi="Calibri" w:cstheme="minorHAnsi"/>
               </w:rPr>
               <w:t>RQF-004</w:t>
             </w:r>
@@ -15355,14 +15166,12 @@
               <w:jc w:val="both"/>
               <w:cnfStyle w:val="100000000000" w:firstRow="1" w:lastRow="0" w:firstColumn="0" w:lastColumn="0" w:oddVBand="0" w:evenVBand="0" w:oddHBand="0" w:evenHBand="0" w:firstRowFirstColumn="0" w:firstRowLastColumn="0" w:lastRowFirstColumn="0" w:lastRowLastColumn="0"/>
               <w:rPr>
-                <w:rFonts w:ascii="Verdana" w:hAnsi="Verdana" w:cstheme="minorBidi"/>
-                <w:highlight w:val="yellow"/>
-              </w:rPr>
-            </w:pPr>
-            <w:r>
-              <w:rPr>
-                <w:rFonts w:ascii="Verdana" w:hAnsi="Verdana" w:cstheme="minorHAnsi"/>
-                <w:highlight w:val="yellow"/>
+                <w:rFonts w:ascii="Calibri" w:hAnsi="Calibri" w:cstheme="minorBidi"/>
+              </w:rPr>
+            </w:pPr>
+            <w:r>
+              <w:rPr>
+                <w:rFonts w:ascii="Calibri" w:hAnsi="Calibri" w:cstheme="minorHAnsi"/>
                 <w:lang w:val="es-ES"/>
               </w:rPr>
               <w:t xml:space="preserve">Convertir temperatura </w:t>
@@ -15384,14 +15193,12 @@
               <w:pStyle w:val="Standard"/>
               <w:jc w:val="both"/>
               <w:rPr>
-                <w:rFonts w:ascii="Verdana" w:hAnsi="Verdana" w:cstheme="minorHAnsi"/>
-                <w:highlight w:val="yellow"/>
-              </w:rPr>
-            </w:pPr>
-            <w:r>
-              <w:rPr>
-                <w:rFonts w:ascii="Verdana" w:hAnsi="Verdana" w:cstheme="minorHAnsi"/>
-                <w:highlight w:val="yellow"/>
+                <w:rFonts w:ascii="Calibri" w:hAnsi="Calibri" w:cstheme="minorHAnsi"/>
+              </w:rPr>
+            </w:pPr>
+            <w:r>
+              <w:rPr>
+                <w:rFonts w:ascii="Calibri" w:hAnsi="Calibri" w:cstheme="minorHAnsi"/>
               </w:rPr>
               <w:t>Descripción</w:t>
             </w:r>
@@ -15407,14 +15214,12 @@
               <w:jc w:val="both"/>
               <w:cnfStyle w:val="000000100000" w:firstRow="0" w:lastRow="0" w:firstColumn="0" w:lastColumn="0" w:oddVBand="0" w:evenVBand="0" w:oddHBand="1" w:evenHBand="0" w:firstRowFirstColumn="0" w:firstRowLastColumn="0" w:lastRowFirstColumn="0" w:lastRowLastColumn="0"/>
               <w:rPr>
-                <w:rFonts w:ascii="Verdana" w:hAnsi="Verdana" w:cstheme="minorHAnsi"/>
-                <w:highlight w:val="yellow"/>
-              </w:rPr>
-            </w:pPr>
-            <w:r>
-              <w:rPr>
-                <w:rFonts w:ascii="Verdana" w:hAnsi="Verdana" w:cstheme="minorHAnsi"/>
-                <w:highlight w:val="yellow"/>
+                <w:rFonts w:ascii="Calibri" w:hAnsi="Calibri" w:cstheme="minorHAnsi"/>
+              </w:rPr>
+            </w:pPr>
+            <w:r>
+              <w:rPr>
+                <w:rFonts w:ascii="Calibri" w:hAnsi="Calibri" w:cstheme="minorHAnsi"/>
                 <w:lang w:val="es-ES"/>
               </w:rPr>
               <w:t>El sistema debe procesar peticiones de conversión de temperatura, y retornar el cálculo matemático correspondiente.</w:t>
@@ -15433,14 +15238,12 @@
               <w:pStyle w:val="Standard"/>
               <w:jc w:val="both"/>
               <w:rPr>
-                <w:rFonts w:ascii="Verdana" w:hAnsi="Verdana" w:cstheme="minorHAnsi"/>
-                <w:highlight w:val="yellow"/>
-              </w:rPr>
-            </w:pPr>
-            <w:r>
-              <w:rPr>
-                <w:rFonts w:ascii="Verdana" w:hAnsi="Verdana" w:cstheme="minorHAnsi"/>
-                <w:highlight w:val="yellow"/>
+                <w:rFonts w:ascii="Calibri" w:hAnsi="Calibri" w:cstheme="minorHAnsi"/>
+              </w:rPr>
+            </w:pPr>
+            <w:r>
+              <w:rPr>
+                <w:rFonts w:ascii="Calibri" w:hAnsi="Calibri" w:cstheme="minorHAnsi"/>
               </w:rPr>
               <w:t>Objetivo</w:t>
             </w:r>
@@ -15456,14 +15259,12 @@
               <w:jc w:val="both"/>
               <w:cnfStyle w:val="000000000000" w:firstRow="0" w:lastRow="0" w:firstColumn="0" w:lastColumn="0" w:oddVBand="0" w:evenVBand="0" w:oddHBand="0" w:evenHBand="0" w:firstRowFirstColumn="0" w:firstRowLastColumn="0" w:lastRowFirstColumn="0" w:lastRowLastColumn="0"/>
               <w:rPr>
-                <w:rFonts w:ascii="Verdana" w:hAnsi="Verdana" w:cstheme="minorHAnsi"/>
-                <w:highlight w:val="yellow"/>
-              </w:rPr>
-            </w:pPr>
-            <w:r>
-              <w:rPr>
-                <w:rFonts w:ascii="Verdana" w:hAnsi="Verdana" w:cstheme="minorHAnsi"/>
-                <w:highlight w:val="yellow"/>
+                <w:rFonts w:ascii="Calibri" w:hAnsi="Calibri" w:cstheme="minorHAnsi"/>
+              </w:rPr>
+            </w:pPr>
+            <w:r>
+              <w:rPr>
+                <w:rFonts w:ascii="Calibri" w:hAnsi="Calibri" w:cstheme="minorHAnsi"/>
               </w:rPr>
               <w:t>OBJ-003</w:t>
             </w:r>
@@ -15484,14 +15285,12 @@
               <w:pStyle w:val="Standard"/>
               <w:jc w:val="both"/>
               <w:rPr>
-                <w:rFonts w:ascii="Verdana" w:hAnsi="Verdana" w:cstheme="minorHAnsi"/>
-                <w:highlight w:val="yellow"/>
-              </w:rPr>
-            </w:pPr>
-            <w:r>
-              <w:rPr>
-                <w:rFonts w:ascii="Verdana" w:hAnsi="Verdana" w:cstheme="minorHAnsi"/>
-                <w:highlight w:val="yellow"/>
+                <w:rFonts w:ascii="Calibri" w:hAnsi="Calibri" w:cstheme="minorHAnsi"/>
+              </w:rPr>
+            </w:pPr>
+            <w:r>
+              <w:rPr>
+                <w:rFonts w:ascii="Calibri" w:hAnsi="Calibri" w:cstheme="minorHAnsi"/>
               </w:rPr>
               <w:t>Importancia</w:t>
             </w:r>
@@ -15507,14 +15306,12 @@
               <w:jc w:val="both"/>
               <w:cnfStyle w:val="000000100000" w:firstRow="0" w:lastRow="0" w:firstColumn="0" w:lastColumn="0" w:oddVBand="0" w:evenVBand="0" w:oddHBand="1" w:evenHBand="0" w:firstRowFirstColumn="0" w:firstRowLastColumn="0" w:lastRowFirstColumn="0" w:lastRowLastColumn="0"/>
               <w:rPr>
-                <w:rFonts w:ascii="Verdana" w:hAnsi="Verdana" w:cstheme="minorHAnsi"/>
-                <w:highlight w:val="yellow"/>
-              </w:rPr>
-            </w:pPr>
-            <w:r>
-              <w:rPr>
-                <w:rFonts w:ascii="Verdana" w:hAnsi="Verdana" w:cstheme="minorHAnsi"/>
-                <w:highlight w:val="yellow"/>
+                <w:rFonts w:ascii="Calibri" w:hAnsi="Calibri" w:cstheme="minorHAnsi"/>
+              </w:rPr>
+            </w:pPr>
+            <w:r>
+              <w:rPr>
+                <w:rFonts w:ascii="Calibri" w:hAnsi="Calibri" w:cstheme="minorHAnsi"/>
               </w:rPr>
               <w:t>Alta</w:t>
             </w:r>
@@ -15532,14 +15329,12 @@
               <w:pStyle w:val="Standard"/>
               <w:jc w:val="both"/>
               <w:rPr>
-                <w:rFonts w:ascii="Verdana" w:hAnsi="Verdana" w:cstheme="minorHAnsi"/>
-                <w:highlight w:val="yellow"/>
-              </w:rPr>
-            </w:pPr>
-            <w:r>
-              <w:rPr>
-                <w:rFonts w:ascii="Verdana" w:hAnsi="Verdana" w:cstheme="minorHAnsi"/>
-                <w:highlight w:val="yellow"/>
+                <w:rFonts w:ascii="Calibri" w:hAnsi="Calibri" w:cstheme="minorHAnsi"/>
+              </w:rPr>
+            </w:pPr>
+            <w:r>
+              <w:rPr>
+                <w:rFonts w:ascii="Calibri" w:hAnsi="Calibri" w:cstheme="minorHAnsi"/>
               </w:rPr>
               <w:t>Estado</w:t>
             </w:r>
@@ -15555,14 +15350,12 @@
               <w:jc w:val="both"/>
               <w:cnfStyle w:val="000000000000" w:firstRow="0" w:lastRow="0" w:firstColumn="0" w:lastColumn="0" w:oddVBand="0" w:evenVBand="0" w:oddHBand="0" w:evenHBand="0" w:firstRowFirstColumn="0" w:firstRowLastColumn="0" w:lastRowFirstColumn="0" w:lastRowLastColumn="0"/>
               <w:rPr>
-                <w:rFonts w:ascii="Verdana" w:hAnsi="Verdana" w:cstheme="minorHAnsi"/>
-                <w:highlight w:val="yellow"/>
-              </w:rPr>
-            </w:pPr>
-            <w:r>
-              <w:rPr>
-                <w:rFonts w:ascii="Verdana" w:hAnsi="Verdana" w:cstheme="minorHAnsi"/>
-                <w:highlight w:val="yellow"/>
+                <w:rFonts w:ascii="Calibri" w:hAnsi="Calibri" w:cstheme="minorHAnsi"/>
+              </w:rPr>
+            </w:pPr>
+            <w:r>
+              <w:rPr>
+                <w:rFonts w:ascii="Calibri" w:hAnsi="Calibri" w:cstheme="minorHAnsi"/>
               </w:rPr>
               <w:t>Aprobado</w:t>
             </w:r>
@@ -15583,14 +15376,12 @@
               <w:pStyle w:val="Standard"/>
               <w:jc w:val="both"/>
               <w:rPr>
-                <w:rFonts w:ascii="Verdana" w:hAnsi="Verdana" w:cstheme="minorHAnsi"/>
-                <w:highlight w:val="yellow"/>
-              </w:rPr>
-            </w:pPr>
-            <w:r>
-              <w:rPr>
-                <w:rFonts w:ascii="Verdana" w:hAnsi="Verdana" w:cstheme="minorHAnsi"/>
-                <w:highlight w:val="yellow"/>
+                <w:rFonts w:ascii="Calibri" w:hAnsi="Calibri" w:cstheme="minorHAnsi"/>
+              </w:rPr>
+            </w:pPr>
+            <w:r>
+              <w:rPr>
+                <w:rFonts w:ascii="Calibri" w:hAnsi="Calibri" w:cstheme="minorHAnsi"/>
               </w:rPr>
               <w:t>Estabilidad</w:t>
             </w:r>
@@ -15606,14 +15397,12 @@
               <w:jc w:val="both"/>
               <w:cnfStyle w:val="000000100000" w:firstRow="0" w:lastRow="0" w:firstColumn="0" w:lastColumn="0" w:oddVBand="0" w:evenVBand="0" w:oddHBand="1" w:evenHBand="0" w:firstRowFirstColumn="0" w:firstRowLastColumn="0" w:lastRowFirstColumn="0" w:lastRowLastColumn="0"/>
               <w:rPr>
-                <w:rFonts w:ascii="Verdana" w:hAnsi="Verdana" w:cstheme="minorHAnsi"/>
-                <w:highlight w:val="yellow"/>
-              </w:rPr>
-            </w:pPr>
-            <w:r>
-              <w:rPr>
-                <w:rFonts w:ascii="Verdana" w:hAnsi="Verdana" w:cstheme="minorHAnsi"/>
-                <w:highlight w:val="yellow"/>
+                <w:rFonts w:ascii="Calibri" w:hAnsi="Calibri" w:cstheme="minorHAnsi"/>
+              </w:rPr>
+            </w:pPr>
+            <w:r>
+              <w:rPr>
+                <w:rFonts w:ascii="Calibri" w:hAnsi="Calibri" w:cstheme="minorHAnsi"/>
               </w:rPr>
               <w:t>Alta</w:t>
             </w:r>
@@ -15631,14 +15420,12 @@
               <w:pStyle w:val="Standard"/>
               <w:jc w:val="both"/>
               <w:rPr>
-                <w:rFonts w:ascii="Verdana" w:hAnsi="Verdana" w:cstheme="minorHAnsi"/>
-                <w:highlight w:val="yellow"/>
-              </w:rPr>
-            </w:pPr>
-            <w:r>
-              <w:rPr>
-                <w:rFonts w:ascii="Verdana" w:hAnsi="Verdana" w:cstheme="minorHAnsi"/>
-                <w:highlight w:val="yellow"/>
+                <w:rFonts w:ascii="Calibri" w:hAnsi="Calibri" w:cstheme="minorHAnsi"/>
+              </w:rPr>
+            </w:pPr>
+            <w:r>
+              <w:rPr>
+                <w:rFonts w:ascii="Calibri" w:hAnsi="Calibri" w:cstheme="minorHAnsi"/>
               </w:rPr>
               <w:t>Comentarios</w:t>
             </w:r>
@@ -15653,45 +15440,39 @@
               <w:pStyle w:val="Standard"/>
               <w:cnfStyle w:val="000000000000" w:firstRow="0" w:lastRow="0" w:firstColumn="0" w:lastColumn="0" w:oddVBand="0" w:evenVBand="0" w:oddHBand="0" w:evenHBand="0" w:firstRowFirstColumn="0" w:firstRowLastColumn="0" w:lastRowFirstColumn="0" w:lastRowLastColumn="0"/>
               <w:rPr>
-                <w:rFonts w:ascii="Verdana" w:hAnsi="Verdana" w:cstheme="minorHAnsi"/>
-                <w:highlight w:val="yellow"/>
-              </w:rPr>
-            </w:pPr>
-            <w:r>
-              <w:rPr>
-                <w:rFonts w:ascii="Verdana" w:hAnsi="Verdana" w:cstheme="minorHAnsi"/>
-                <w:highlight w:val="yellow"/>
+                <w:rFonts w:ascii="Calibri" w:hAnsi="Calibri" w:cstheme="minorHAnsi"/>
+              </w:rPr>
+            </w:pPr>
+            <w:r>
+              <w:rPr>
+                <w:rFonts w:ascii="Calibri" w:hAnsi="Calibri" w:cstheme="minorHAnsi"/>
               </w:rPr>
               <w:t>Las unidades disponibles para la conversión son:</w:t>
             </w:r>
             <w:r>
               <w:rPr>
-                <w:rFonts w:ascii="Verdana" w:hAnsi="Verdana" w:cstheme="minorHAnsi"/>
-                <w:highlight w:val="yellow"/>
+                <w:rFonts w:ascii="Calibri" w:hAnsi="Calibri" w:cstheme="minorHAnsi"/>
               </w:rPr>
               <w:t xml:space="preserve"> </w:t>
             </w:r>
             <w:proofErr w:type="spellStart"/>
             <w:r>
               <w:rPr>
-                <w:rFonts w:ascii="Verdana" w:hAnsi="Verdana" w:cstheme="minorHAnsi"/>
-                <w:highlight w:val="yellow"/>
+                <w:rFonts w:ascii="Calibri" w:hAnsi="Calibri" w:cstheme="minorHAnsi"/>
               </w:rPr>
               <w:t>farenheit</w:t>
             </w:r>
             <w:proofErr w:type="spellEnd"/>
             <w:r>
               <w:rPr>
-                <w:rFonts w:ascii="Verdana" w:hAnsi="Verdana" w:cstheme="minorHAnsi"/>
-                <w:highlight w:val="yellow"/>
+                <w:rFonts w:ascii="Calibri" w:hAnsi="Calibri" w:cstheme="minorHAnsi"/>
               </w:rPr>
               <w:t xml:space="preserve">, kelvin, Celsius, newton y </w:t>
             </w:r>
             <w:proofErr w:type="spellStart"/>
             <w:r>
               <w:rPr>
-                <w:rFonts w:ascii="Verdana" w:hAnsi="Verdana" w:cstheme="minorHAnsi"/>
-                <w:highlight w:val="yellow"/>
+                <w:rFonts w:ascii="Calibri" w:hAnsi="Calibri" w:cstheme="minorHAnsi"/>
               </w:rPr>
               <w:t>reaumur</w:t>
             </w:r>
@@ -15703,13 +15484,12 @@
               <w:jc w:val="both"/>
               <w:cnfStyle w:val="000000000000" w:firstRow="0" w:lastRow="0" w:firstColumn="0" w:lastColumn="0" w:oddVBand="0" w:evenVBand="0" w:oddHBand="0" w:evenHBand="0" w:firstRowFirstColumn="0" w:firstRowLastColumn="0" w:lastRowFirstColumn="0" w:lastRowLastColumn="0"/>
               <w:rPr>
-                <w:rFonts w:ascii="Verdana" w:hAnsi="Verdana" w:cstheme="minorHAnsi"/>
-              </w:rPr>
-            </w:pPr>
-            <w:r>
-              <w:rPr>
-                <w:rFonts w:ascii="Verdana" w:hAnsi="Verdana" w:cstheme="minorHAnsi"/>
-                <w:highlight w:val="yellow"/>
+                <w:rFonts w:ascii="Calibri" w:hAnsi="Calibri" w:cstheme="minorHAnsi"/>
+              </w:rPr>
+            </w:pPr>
+            <w:r>
+              <w:rPr>
+                <w:rFonts w:ascii="Calibri" w:hAnsi="Calibri" w:cstheme="minorHAnsi"/>
               </w:rPr>
               <w:t>.</w:t>
             </w:r>
@@ -15896,6 +15676,11 @@
           </w:tcPr>
           <w:p>
             <w:r>
+              <w:rPr>
+                <w:rFonts w:ascii="Arial" w:hAnsi="Arial"/>
+                <w:b/>
+                <w:color w:val="FFFFFF" w:themeColor="background1"/>
+              </w:rPr>
               <w:t>Protocolo de Arquitectura (SOAP)</w:t>
             </w:r>
           </w:p>
@@ -17920,7 +17705,7 @@
               <w:cnfStyle w:val="100000000000" w:firstRow="1" w:lastRow="0" w:firstColumn="0" w:lastColumn="0" w:oddVBand="0" w:evenVBand="0" w:oddHBand="0" w:evenHBand="0" w:firstRowFirstColumn="0" w:firstRowLastColumn="0" w:lastRowFirstColumn="0" w:lastRowLastColumn="0"/>
             </w:pPr>
             <w:r>
-              <w:t>Accesibilidad</w:t>
+              <w:t>Mantenibilidad</w:t>
             </w:r>
           </w:p>
         </w:tc>

</xml_diff>

<commit_message>
docs: integrar evidencias, diagramas de 6 CUs y unificar entregables en las 4 variantes
- Integrar diagramas PowerDesigner (OOm) y modelos PNG de los 6 Casos de Uso (CU-01 a CU-06) en TI.1.1, TI.1.2, TI.1.3 y TI.1.4.
- Unificar documentos ERS, ECUD, manuales técnicos y presentaciones PPTX sin marcadores pendientes.
- Actualizar plantillas maestras en vault/03-deliverables/templates/ (PLANTILLA_ECUD.docx y PLANTILLA_PRESENTACION.pptx).
- Actualizar scripts/generate_docs.py para reproducibilidad total con stacks oficiales (.NET 10, Payara 7, Java 11/17) y autores formales Murillo/Viche.
- Homogeneizar manuales técnicos y evidencias fotográficas en vault/06-projects/ti-1-4-rest-dotnet/.
- Validar entrega completa con scripts/validate_deliverables.py (16/16 PASS, 0 errores).
</commit_message>
<xml_diff>
--- a/TI.1.1. PAO202651_SOAP_JAVA_SINBDD_NRC36884_GR09/01. UML/01. ERS/ERS_SOAP_JAVA_SINBDD_GR09.docx
+++ b/TI.1.1. PAO202651_SOAP_JAVA_SINBDD_NRC36884_GR09/01. UML/01. ERS/ERS_SOAP_JAVA_SINBDD_GR09.docx
@@ -153,7 +153,7 @@
                               <w:jc w:val="center"/>
                             </w:pPr>
                             <w:r>
-                              <w:t>Viche Castillo, Julio Enrique</w:t>
+                              <w:t>Viche Castillo, Julio Enrique; Murillo Medina, Gabriel Omar</w:t>
                             </w:r>
                           </w:p>
                           <w:p>
@@ -162,7 +162,7 @@
                               <w:jc w:val="center"/>
                             </w:pPr>
                             <w:r>
-                              <w:t>Murillo Medina, Gabriel Omar</w:t>
+                              <w:t/>
                             </w:r>
                           </w:p>
                           <w:p>
@@ -209,11 +209,9 @@
                             <w:pPr>
                               <w:jc w:val="center"/>
                             </w:pPr>
-                            <w:proofErr w:type="gramStart"/>
                             <w:r>
                               <w:t>MIS.MDU.CCNA.CCIA</w:t>
                             </w:r>
-                            <w:proofErr w:type="gramEnd"/>
                             <w:r>
                               <w:t>.</w:t>
                             </w:r>
@@ -441,7 +439,7 @@
                         <w:jc w:val="center"/>
                       </w:pPr>
                       <w:r>
-                        <w:t>Viche Castillo, Julio Enrique</w:t>
+                        <w:t>Viche Castillo, Julio Enrique; Murillo Medina, Gabriel Omar</w:t>
                       </w:r>
                     </w:p>
                     <w:p>
@@ -450,7 +448,7 @@
                         <w:jc w:val="center"/>
                       </w:pPr>
                       <w:r>
-                        <w:t>Murillo Medina, Gabriel Omar</w:t>
+                        <w:t/>
                       </w:r>
                     </w:p>
                     <w:p>
@@ -497,11 +495,9 @@
                       <w:pPr>
                         <w:jc w:val="center"/>
                       </w:pPr>
-                      <w:proofErr w:type="gramStart"/>
                       <w:r>
                         <w:t>MIS.MDU.CCNA.CCIA</w:t>
                       </w:r>
-                      <w:proofErr w:type="gramEnd"/>
                       <w:r>
                         <w:t>.</w:t>
                       </w:r>
@@ -4289,6 +4285,19 @@
         <w:t>ESPECIFICACIÓN DE REQUERIMIENTOS DE SOFTWARE PARA SOA CON SOAP EN JAVA SIN BDD</w:t>
       </w:r>
     </w:p>
+    <w:p>
+      <w:pPr>
+        <w:jc w:val="left"/>
+        <w:spacing w:before="240" w:after="120"/>
+      </w:pPr>
+      <w:r>
+        <w:rPr>
+          <w:rFonts w:ascii="Arial" w:hAnsi="Arial"/>
+          <w:sz w:val="22"/>
+        </w:rPr>
+        <w:t xml:space="preserve">Autores: Viche Castillo, Julio Enrique; Murillo Medina, Gabriel Omar</w:t>
+      </w:r>
+    </w:p>
     <w:sdt>
       <w:sdtPr>
         <w:id w:val="-1895271822"/>
@@ -8058,7 +8067,7 @@
         </w:numPr>
       </w:pPr>
       <w:r>
-        <w:t>El sistema será desarrollado con NetBeans como IDE y sin uso de base de datos (SINBDD). La arquitectura es SOA (Service Oriented Architecture) usando Servicios Web SOAP con Jakarta EE / JAX-WS.</w:t>
+        <w:t>El sistema usa NetBeans y no implementa base de datos (SINBDD). El servidor SOAP 1.1 se compila con Java 11, Jakarta EE Web API 10.0.0, Jakarta XML Web Services API 4.0.1 y Metro JAX-WS Runtime 4.0.2; se empaqueta como WAR para Payara Server 7.2026.10. Los módulos cliente Java usan release 11; Android usa Java 17, compileSdk/targetSdk 35 y minSdk 24.</w:t>
       </w:r>
     </w:p>
     <w:bookmarkEnd w:id="2"/>
@@ -8101,7 +8110,7 @@
     </w:p>
     <w:p>
       <w:r>
-        <w:t>Este documento de Especificación de Requerimientos de Software ha sido creado siguiendo la norma IEEE-830 para la especificación de requerimientos, que forma parte de la documentación generada previo al posible desarrollo e implementación de la capa de servicios del sistema “Conversión de Unidades Monster”. El documento detalla la arquitectura, diseño de interfaces y comportamientos funcionales necesarios para construir una solución basada en el protocolo SOAP en JAVA, incluyendo los mecanismos de consumo por parte cuatro clientes diferentes y las restricciones tecnológicas.</w:t>
+        <w:t>Este documento de Especificación de Requerimientos describe la implementación GR09 “Conversión de Unidades Monster”, la arquitectura SOAP en Java, los cuatro clientes, sus requisitos y las tecnologías verificadas en el código.</w:t>
       </w:r>
     </w:p>
     <w:p>
@@ -8260,11 +8269,9 @@
         </w:numPr>
         <w:spacing w:before="0" w:after="0"/>
       </w:pPr>
-      <w:proofErr w:type="spellStart"/>
       <w:r>
         <w:t>Login</w:t>
       </w:r>
-      <w:proofErr w:type="spellEnd"/>
       <w:r>
         <w:t xml:space="preserve"> y autenticación del cliente. </w:t>
       </w:r>
@@ -8294,11 +8301,9 @@
       <w:r>
         <w:t xml:space="preserve">Control de acceso de los </w:t>
       </w:r>
-      <w:proofErr w:type="spellStart"/>
       <w:r>
         <w:t>endpoints</w:t>
       </w:r>
-      <w:proofErr w:type="spellEnd"/>
       <w:r>
         <w:t xml:space="preserve"> de conversión. </w:t>
       </w:r>
@@ -8724,14 +8729,12 @@
                 <w:rFonts w:cs="Calibri"/>
               </w:rPr>
             </w:pPr>
-            <w:proofErr w:type="spellStart"/>
             <w:r>
               <w:rPr>
                 <w:rFonts w:cs="Calibri"/>
               </w:rPr>
               <w:t>Endpoint</w:t>
             </w:r>
-            <w:proofErr w:type="spellEnd"/>
           </w:p>
         </w:tc>
         <w:tc>
@@ -8942,15 +8945,13 @@
               </w:rPr>
             </w:pPr>
             <w:bookmarkStart w:id="18" w:name="_Toc61544620"/>
-            <w:proofErr w:type="spellStart"/>
             <w:r>
               <w:rPr>
                 <w:rFonts w:cs="Calibri"/>
               </w:rPr>
-              <w:t>Netbeans</w:t>
+              <w:t>NetBeans</w:t>
             </w:r>
             <w:bookmarkEnd w:id="18"/>
-            <w:proofErr w:type="spellEnd"/>
           </w:p>
         </w:tc>
         <w:tc>
@@ -8969,7 +8970,7 @@
               <w:rPr>
                 <w:rFonts w:cs="Calibri"/>
               </w:rPr>
-              <w:t>Entorno de desarrollo integrado libre, hecho principalmente para el lenguaje de programación Java.</w:t>
+              <w:t>IDE para desarrollar módulos Java. La versión no está fijada en los archivos del proyecto.</w:t>
             </w:r>
             <w:bookmarkEnd w:id="19"/>
           </w:p>
@@ -9189,14 +9190,12 @@
               </w:rPr>
               <w:t>Arquitectura Orientada a Servicios (Service-</w:t>
             </w:r>
-            <w:proofErr w:type="spellStart"/>
             <w:r>
               <w:rPr>
                 <w:rFonts w:cs="Calibri"/>
               </w:rPr>
               <w:t>Oriented</w:t>
             </w:r>
-            <w:proofErr w:type="spellEnd"/>
             <w:r>
               <w:rPr>
                 <w:rFonts w:cs="Calibri"/>
@@ -9286,28 +9285,24 @@
               </w:rPr>
               <w:t>Transferencia de Estado Representacional (</w:t>
             </w:r>
-            <w:proofErr w:type="spellStart"/>
             <w:r>
               <w:rPr>
                 <w:rFonts w:cs="Calibri"/>
               </w:rPr>
               <w:t>Represantational</w:t>
             </w:r>
-            <w:proofErr w:type="spellEnd"/>
             <w:r>
               <w:rPr>
                 <w:rFonts w:cs="Calibri"/>
               </w:rPr>
               <w:t xml:space="preserve"> </w:t>
             </w:r>
-            <w:proofErr w:type="spellStart"/>
             <w:r>
               <w:rPr>
                 <w:rFonts w:cs="Calibri"/>
               </w:rPr>
               <w:t>State</w:t>
             </w:r>
-            <w:proofErr w:type="spellEnd"/>
             <w:r>
               <w:rPr>
                 <w:rFonts w:cs="Calibri"/>
@@ -9354,14 +9349,12 @@
               </w:rPr>
               <w:t>Lenguaje de Marcado Extensible (</w:t>
             </w:r>
-            <w:proofErr w:type="spellStart"/>
             <w:r>
               <w:rPr>
                 <w:rFonts w:cs="Calibri"/>
               </w:rPr>
               <w:t>eXtensible</w:t>
             </w:r>
-            <w:proofErr w:type="spellEnd"/>
             <w:r>
               <w:rPr>
                 <w:rFonts w:cs="Calibri"/>
@@ -9411,14 +9404,12 @@
               </w:rPr>
               <w:t>Protocolo de Transferencia de Hipertexto (</w:t>
             </w:r>
-            <w:proofErr w:type="spellStart"/>
             <w:r>
               <w:rPr>
                 <w:rFonts w:cs="Calibri"/>
               </w:rPr>
               <w:t>Hypertext</w:t>
             </w:r>
-            <w:proofErr w:type="spellEnd"/>
             <w:r>
               <w:rPr>
                 <w:rFonts w:cs="Calibri"/>
@@ -9828,14 +9819,12 @@
               </w:rPr>
               <w:t xml:space="preserve">De la plantilla de formato del documento © &amp; </w:t>
             </w:r>
-            <w:proofErr w:type="spellStart"/>
             <w:r>
               <w:rPr>
                 <w:rFonts w:asciiTheme="minorHAnsi" w:hAnsiTheme="minorHAnsi" w:cstheme="minorHAnsi"/>
               </w:rPr>
               <w:t>Coloriuris</w:t>
             </w:r>
-            <w:proofErr w:type="spellEnd"/>
             <w:r>
               <w:rPr>
                 <w:rFonts w:asciiTheme="minorHAnsi" w:hAnsiTheme="minorHAnsi" w:cstheme="minorHAnsi"/>
@@ -10158,28 +10147,24 @@
         </w:rPr>
         <w:t xml:space="preserve">Procesar transformaciones entres estas unidades de medida de temperatura: </w:t>
       </w:r>
-      <w:proofErr w:type="spellStart"/>
       <w:r>
         <w:rPr>
           <w:rFonts w:cs="Calibri"/>
         </w:rPr>
         <w:t>farenheit</w:t>
       </w:r>
-      <w:proofErr w:type="spellEnd"/>
       <w:r>
         <w:rPr>
           <w:rFonts w:cs="Calibri"/>
         </w:rPr>
         <w:t xml:space="preserve">, kelvin, Celsius, newton y </w:t>
       </w:r>
-      <w:proofErr w:type="spellStart"/>
       <w:r>
         <w:rPr>
           <w:rFonts w:cs="Calibri"/>
         </w:rPr>
         <w:t>reaumur</w:t>
       </w:r>
-      <w:proofErr w:type="spellEnd"/>
       <w:r>
         <w:rPr>
           <w:rFonts w:cs="Calibri"/>
@@ -10791,19 +10776,15 @@
       <w:r>
         <w:t xml:space="preserve">, se hará uso de la herramienta </w:t>
       </w:r>
-      <w:proofErr w:type="spellStart"/>
       <w:r>
         <w:t>Power</w:t>
       </w:r>
-      <w:proofErr w:type="spellEnd"/>
       <w:r>
         <w:t xml:space="preserve"> </w:t>
       </w:r>
-      <w:proofErr w:type="spellStart"/>
       <w:r>
         <w:t>Designer</w:t>
       </w:r>
-      <w:proofErr w:type="spellEnd"/>
       <w:r>
         <w:t xml:space="preserve">. </w:t>
       </w:r>
@@ -10869,7 +10850,7 @@
         <w:spacing w:before="0" w:after="0"/>
       </w:pPr>
       <w:r>
-        <w:t>El servidor de aplicaciones es Payara Server / Tomcat embebido y la arquitectura es Jakarta EE / JAX-WS.</w:t>
+        <w:t>El servidor SOAP usa Jakarta EE Web API 10.0.0, Jakarta XML Web Services API 4.0.1 y Metro JAX-WS Runtime 4.0.2. Se empaqueta como WAR y se despliega en Payara Server 7.2026.10.</w:t>
       </w:r>
     </w:p>
     <w:p>
@@ -10882,7 +10863,7 @@
         <w:spacing w:before="0" w:after="0"/>
       </w:pPr>
       <w:r>
-        <w:t>El entorno de desarrollo para la construcción del sistema es NetBeans.</w:t>
+        <w:t>El entorno Java usa NetBeans; los archivos del proyecto no fijan la versión del IDE.</w:t>
       </w:r>
     </w:p>
     <w:p>
@@ -11594,7 +11575,6 @@
                 <w:szCs w:val="20"/>
               </w:rPr>
             </w:pPr>
-            <w:proofErr w:type="spellStart"/>
             <w:r>
               <w:rPr>
                 <w:sz w:val="20"/>
@@ -11602,7 +11582,6 @@
               </w:rPr>
               <w:t>Genius</w:t>
             </w:r>
-            <w:proofErr w:type="spellEnd"/>
           </w:p>
         </w:tc>
         <w:tc>
@@ -11727,7 +11706,6 @@
                 <w:szCs w:val="20"/>
               </w:rPr>
             </w:pPr>
-            <w:proofErr w:type="spellStart"/>
             <w:r>
               <w:rPr>
                 <w:sz w:val="20"/>
@@ -11735,7 +11713,6 @@
               </w:rPr>
               <w:t>Genius</w:t>
             </w:r>
-            <w:proofErr w:type="spellEnd"/>
           </w:p>
         </w:tc>
         <w:tc>
@@ -11955,7 +11932,6 @@
               </w:rPr>
               <w:t xml:space="preserve">, Memoria </w:t>
             </w:r>
-            <w:proofErr w:type="spellStart"/>
             <w:r>
               <w:rPr>
                 <w:sz w:val="20"/>
@@ -11963,7 +11939,6 @@
               </w:rPr>
               <w:t>Ram</w:t>
             </w:r>
-            <w:proofErr w:type="spellEnd"/>
             <w:r>
               <w:rPr>
                 <w:sz w:val="20"/>
@@ -11992,7 +11967,6 @@
               </w:rPr>
               <w:t xml:space="preserve">. 256gb </w:t>
             </w:r>
-            <w:proofErr w:type="spellStart"/>
             <w:r>
               <w:rPr>
                 <w:sz w:val="20"/>
@@ -12000,7 +11974,6 @@
               </w:rPr>
               <w:t>ssd</w:t>
             </w:r>
-            <w:proofErr w:type="spellEnd"/>
             <w:r>
               <w:rPr>
                 <w:sz w:val="20"/>
@@ -12266,7 +12239,7 @@
               <w:cnfStyle w:val="000000100000" w:firstRow="0" w:lastRow="0" w:firstColumn="0" w:lastColumn="0" w:oddVBand="0" w:evenVBand="0" w:oddHBand="1" w:evenHBand="0" w:firstRowFirstColumn="0" w:firstRowLastColumn="0" w:lastRowFirstColumn="0" w:lastRowLastColumn="0"/>
             </w:pPr>
             <w:r>
-              <w:t>Windows es el nombre de una familia de distribuciones de software para PC, smartphone, servidores y sistemas empotrados, desarrollados y vendidos por Microsoft y disponibles para múltiples arquitecturas, tales como x86 y ARM</w:t>
+              <w:t>Sistema operativo de escritorio indicado como entorno de desarrollo del proyecto.</w:t>
             </w:r>
           </w:p>
         </w:tc>
@@ -12279,7 +12252,7 @@
               <w:cnfStyle w:val="000000100000" w:firstRow="0" w:lastRow="0" w:firstColumn="0" w:lastColumn="0" w:oddVBand="0" w:evenVBand="0" w:oddHBand="1" w:evenHBand="0" w:firstRowFirstColumn="0" w:firstRowLastColumn="0" w:lastRowFirstColumn="0" w:lastRowLastColumn="0"/>
             </w:pPr>
             <w:r>
-              <w:t>Es la plataforma sobre la cual se va a ejecutar la aplicación y la base de datos el cual cuenta con un soporte hasta 2020</w:t>
+              <w:t>Windows 11 figura como entorno de desarrollo. Los archivos del proyecto no fijan la versión de actualización del sistema operativo.</w:t>
             </w:r>
           </w:p>
         </w:tc>
@@ -12316,7 +12289,7 @@
               <w:cnfStyle w:val="000000000000" w:firstRow="0" w:lastRow="0" w:firstColumn="0" w:lastColumn="0" w:oddVBand="0" w:evenVBand="0" w:oddHBand="0" w:evenHBand="0" w:firstRowFirstColumn="0" w:firstRowLastColumn="0" w:lastRowFirstColumn="0" w:lastRowLastColumn="0"/>
             </w:pPr>
             <w:r>
-              <w:t>Número de especificación: 8</w:t>
+              <w:t>Versión: no declarada en los archivos del proyecto.</w:t>
             </w:r>
           </w:p>
           <w:p>
@@ -12324,7 +12297,7 @@
               <w:cnfStyle w:val="000000000000" w:firstRow="0" w:lastRow="0" w:firstColumn="0" w:lastColumn="0" w:oddVBand="0" w:evenVBand="0" w:oddHBand="0" w:evenHBand="0" w:firstRowFirstColumn="0" w:firstRowLastColumn="0" w:lastRowFirstColumn="0" w:lastRowLastColumn="0"/>
             </w:pPr>
             <w:r>
-              <w:t>Número de versión: 8.0.2</w:t>
+              <w:t>Versión del IDE: no declarada.</w:t>
             </w:r>
           </w:p>
           <w:p>
@@ -12332,14 +12305,14 @@
               <w:cnfStyle w:val="000000000000" w:firstRow="0" w:lastRow="0" w:firstColumn="0" w:lastColumn="0" w:oddVBand="0" w:evenVBand="0" w:oddHBand="0" w:evenHBand="0" w:firstRowFirstColumn="0" w:firstRowLastColumn="0" w:lastRowFirstColumn="0" w:lastRowLastColumn="0"/>
             </w:pPr>
             <w:r>
-              <w:t>Fuente:</w:t>
+              <w:t>Fuente: https://netbeans.apache.org/</w:t>
             </w:r>
             <w:hyperlink r:id="rId15" w:history="1">
               <w:r>
                 <w:rPr>
                   <w:rStyle w:val="Hipervnculo"/>
                 </w:rPr>
-                <w:t xml:space="preserve"> https://www.netbeanside.com/</w:t>
+                <w:t xml:space="preserve"/>
               </w:r>
             </w:hyperlink>
           </w:p>
@@ -12348,7 +12321,7 @@
               <w:cnfStyle w:val="000000000000" w:firstRow="0" w:lastRow="0" w:firstColumn="0" w:lastColumn="0" w:oddVBand="0" w:evenVBand="0" w:oddHBand="0" w:evenHBand="0" w:firstRowFirstColumn="0" w:firstRowLastColumn="0" w:lastRowFirstColumn="0" w:lastRowLastColumn="0"/>
             </w:pPr>
             <w:r>
-              <w:t>Distribución: libre</w:t>
+              <w:t>Distribución: código abierto.</w:t>
             </w:r>
           </w:p>
         </w:tc>
@@ -12361,7 +12334,7 @@
               <w:cnfStyle w:val="000000000000" w:firstRow="0" w:lastRow="0" w:firstColumn="0" w:lastColumn="0" w:oddVBand="0" w:evenVBand="0" w:oddHBand="0" w:evenHBand="0" w:firstRowFirstColumn="0" w:firstRowLastColumn="0" w:lastRowFirstColumn="0" w:lastRowLastColumn="0"/>
             </w:pPr>
             <w:r>
-              <w:t>Diseñar y generar interfaces y el funcionamiento del programa mediante el lenguaje de programación Java.</w:t>
+              <w:t>Desarrollar y depurar los módulos Java del proyecto.</w:t>
             </w:r>
           </w:p>
         </w:tc>
@@ -12374,13 +12347,13 @@
               <w:cnfStyle w:val="000000000000" w:firstRow="0" w:lastRow="0" w:firstColumn="0" w:lastColumn="0" w:oddVBand="0" w:evenVBand="0" w:oddHBand="0" w:evenHBand="0" w:firstRowFirstColumn="0" w:firstRowLastColumn="0" w:lastRowFirstColumn="0" w:lastRowLastColumn="0"/>
             </w:pPr>
             <w:r>
-              <w:t xml:space="preserve">Herramienta que se utiliza para desarrollar aplicaciones Web, Móvil y de Escritorio para diferentes lenguajes de programación como son </w:t>
-            </w:r>
-            <w:r>
-              <w:t>Java, C++</w:t>
-            </w:r>
-            <w:r>
-              <w:t>, Ruby y    PHP entre    otros</w:t>
+              <w:t xml:space="preserve">IDE empleado para los proyectos Java; el repositorio no fija su versión.</w:t>
+            </w:r>
+            <w:r>
+              <w:t/>
+            </w:r>
+            <w:r>
+              <w:t/>
             </w:r>
           </w:p>
         </w:tc>
@@ -12417,19 +12390,15 @@
             <w:r>
               <w:t xml:space="preserve">Nombre: </w:t>
             </w:r>
-            <w:proofErr w:type="spellStart"/>
             <w:r>
               <w:t>Power</w:t>
             </w:r>
-            <w:proofErr w:type="spellEnd"/>
             <w:r>
               <w:t xml:space="preserve"> </w:t>
             </w:r>
-            <w:proofErr w:type="spellStart"/>
             <w:r>
               <w:t>Designer</w:t>
             </w:r>
-            <w:proofErr w:type="spellEnd"/>
           </w:p>
           <w:p>
             <w:pPr>
@@ -12532,15 +12501,13 @@
               <w:cnfStyle w:val="000000000000" w:firstRow="0" w:lastRow="0" w:firstColumn="0" w:lastColumn="0" w:oddVBand="0" w:evenVBand="0" w:oddHBand="0" w:evenHBand="0" w:firstRowFirstColumn="0" w:firstRowLastColumn="0" w:lastRowFirstColumn="0" w:lastRowLastColumn="0"/>
             </w:pPr>
             <w:r>
-              <w:t xml:space="preserve">Nombre: </w:t>
-            </w:r>
-            <w:proofErr w:type="spellStart"/>
-            <w:r>
-              <w:t>Jakarta</w:t>
-            </w:r>
-            <w:proofErr w:type="spellEnd"/>
-            <w:r>
-              <w:t xml:space="preserve"> EE </w:t>
+              <w:t xml:space="preserve">Nombre: Jakarta EE Web API / Jakarta XML Web Services</w:t>
+            </w:r>
+            <w:r>
+              <w:t/>
+            </w:r>
+            <w:r>
+              <w:t xml:space="preserve"/>
             </w:r>
           </w:p>
           <w:p>
@@ -12548,7 +12515,7 @@
               <w:cnfStyle w:val="000000000000" w:firstRow="0" w:lastRow="0" w:firstColumn="0" w:lastColumn="0" w:oddVBand="0" w:evenVBand="0" w:oddHBand="0" w:evenHBand="0" w:firstRowFirstColumn="0" w:firstRowLastColumn="0" w:lastRowFirstColumn="0" w:lastRowLastColumn="0"/>
             </w:pPr>
             <w:r>
-              <w:t xml:space="preserve">Versión: 8/10 </w:t>
+              <w:t xml:space="preserve">Java 11; Jakarta EE Web API 10.0.0; Jakarta XML Web Services API 4.0.1; Metro JAX-WS Runtime 4.0.2.</w:t>
             </w:r>
           </w:p>
           <w:p>
@@ -12556,15 +12523,15 @@
               <w:cnfStyle w:val="000000000000" w:firstRow="0" w:lastRow="0" w:firstColumn="0" w:lastColumn="0" w:oddVBand="0" w:evenVBand="0" w:oddHBand="0" w:evenHBand="0" w:firstRowFirstColumn="0" w:firstRowLastColumn="0" w:lastRowFirstColumn="0" w:lastRowLastColumn="0"/>
             </w:pPr>
             <w:r>
-              <w:t xml:space="preserve">Fuente: </w:t>
+              <w:t xml:space="preserve">Fuente: https://jakarta.ee/specifications/xml-web-services/4.0/</w:t>
             </w:r>
             <w:hyperlink r:id="rId16" w:history="1">
               <w:r>
-                <w:t>https://jakarta.ee/</w:t>
+                <w:t/>
               </w:r>
             </w:hyperlink>
             <w:r>
-              <w:t xml:space="preserve"> </w:t>
+              <w:t xml:space="preserve"/>
             </w:r>
           </w:p>
           <w:p>
@@ -12572,7 +12539,7 @@
               <w:cnfStyle w:val="000000000000" w:firstRow="0" w:lastRow="0" w:firstColumn="0" w:lastColumn="0" w:oddVBand="0" w:evenVBand="0" w:oddHBand="0" w:evenHBand="0" w:firstRowFirstColumn="0" w:firstRowLastColumn="0" w:lastRowFirstColumn="0" w:lastRowLastColumn="0"/>
             </w:pPr>
             <w:r>
-              <w:t>Distribución: Código abierto</w:t>
+              <w:t>Distribución: componentes de código abierto.</w:t>
             </w:r>
           </w:p>
           <w:p>
@@ -12580,7 +12547,7 @@
               <w:cnfStyle w:val="000000000000" w:firstRow="0" w:lastRow="0" w:firstColumn="0" w:lastColumn="0" w:oddVBand="0" w:evenVBand="0" w:oddHBand="0" w:evenHBand="0" w:firstRowFirstColumn="0" w:firstRowLastColumn="0" w:lastRowFirstColumn="0" w:lastRowLastColumn="0"/>
             </w:pPr>
             <w:r>
-              <w:t>Precio: Gratuito</w:t>
+              <w:t>Precio: no aplica al proyecto.</w:t>
             </w:r>
           </w:p>
         </w:tc>
@@ -12593,18 +12560,16 @@
               <w:cnfStyle w:val="000000000000" w:firstRow="0" w:lastRow="0" w:firstColumn="0" w:lastColumn="0" w:oddVBand="0" w:evenVBand="0" w:oddHBand="0" w:evenHBand="0" w:firstRowFirstColumn="0" w:firstRowLastColumn="0" w:lastRowFirstColumn="0" w:lastRowLastColumn="0"/>
             </w:pPr>
             <w:r>
-              <w:t xml:space="preserve">Plataforma de código abierto impulsada por la Eclipse </w:t>
-            </w:r>
-            <w:proofErr w:type="spellStart"/>
-            <w:r>
-              <w:t>Foundation</w:t>
-            </w:r>
-            <w:proofErr w:type="spellEnd"/>
-            <w:r>
-              <w:t xml:space="preserve"> para el desarrollo de aplicaciones empresariales e </w:t>
-            </w:r>
-            <w:r>
-              <w:t>institucionales en Java.</w:t>
+              <w:t xml:space="preserve">APIs Jakarta EE y Metro implementan servicios SOAP con JAX-WS y mensajes XML.</w:t>
+            </w:r>
+            <w:r>
+              <w:t/>
+            </w:r>
+            <w:r>
+              <w:t xml:space="preserve"/>
+            </w:r>
+            <w:r>
+              <w:t/>
             </w:r>
           </w:p>
         </w:tc>
@@ -12617,18 +12582,16 @@
               <w:cnfStyle w:val="000000000000" w:firstRow="0" w:lastRow="0" w:firstColumn="0" w:lastColumn="0" w:oddVBand="0" w:evenVBand="0" w:oddHBand="0" w:evenHBand="0" w:firstRowFirstColumn="0" w:firstRowLastColumn="0" w:lastRowFirstColumn="0" w:lastRowLastColumn="0"/>
             </w:pPr>
             <w:r>
-              <w:t xml:space="preserve">Proveer el conjunto de </w:t>
-            </w:r>
-            <w:proofErr w:type="spellStart"/>
-            <w:r>
-              <w:t>APIs</w:t>
-            </w:r>
-            <w:proofErr w:type="spellEnd"/>
-            <w:r>
-              <w:t xml:space="preserve"> y anotaciones necesarias para construir la lógica </w:t>
-            </w:r>
-            <w:r>
-              <w:t>del servidor y estructurar los servicios web de conversión.</w:t>
+              <w:t xml:space="preserve">Exponer y ejecutar el backend SOAP 1.1 empaquetado como WAR.</w:t>
+            </w:r>
+            <w:r>
+              <w:t/>
+            </w:r>
+            <w:r>
+              <w:t xml:space="preserve"/>
+            </w:r>
+            <w:r>
+              <w:t/>
             </w:r>
           </w:p>
         </w:tc>
@@ -12668,23 +12631,19 @@
               <w:cnfStyle w:val="000000100000" w:firstRow="0" w:lastRow="0" w:firstColumn="0" w:lastColumn="0" w:oddVBand="0" w:evenVBand="0" w:oddHBand="1" w:evenHBand="0" w:firstRowFirstColumn="0" w:firstRowLastColumn="0" w:lastRowFirstColumn="0" w:lastRowLastColumn="0"/>
             </w:pPr>
             <w:r>
-              <w:t xml:space="preserve">Versión: 5/6 </w:t>
-            </w:r>
-            <w:proofErr w:type="spellStart"/>
-            <w:r>
-              <w:t>Community</w:t>
-            </w:r>
-            <w:proofErr w:type="spellEnd"/>
-            <w:r>
-              <w:t xml:space="preserve"> </w:t>
-            </w:r>
-            <w:proofErr w:type="spellStart"/>
-            <w:r>
-              <w:t>Edition</w:t>
-            </w:r>
-            <w:proofErr w:type="spellEnd"/>
-            <w:r>
-              <w:t xml:space="preserve"> </w:t>
+              <w:t xml:space="preserve">Versión: 7.2026.10</w:t>
+            </w:r>
+            <w:r>
+              <w:t/>
+            </w:r>
+            <w:r>
+              <w:t xml:space="preserve"/>
+            </w:r>
+            <w:r>
+              <w:t/>
+            </w:r>
+            <w:r>
+              <w:t xml:space="preserve"/>
             </w:r>
           </w:p>
           <w:p>
@@ -12692,14 +12651,14 @@
               <w:cnfStyle w:val="000000100000" w:firstRow="0" w:lastRow="0" w:firstColumn="0" w:lastColumn="0" w:oddVBand="0" w:evenVBand="0" w:oddHBand="1" w:evenHBand="0" w:firstRowFirstColumn="0" w:firstRowLastColumn="0" w:lastRowFirstColumn="0" w:lastRowLastColumn="0"/>
             </w:pPr>
             <w:r>
-              <w:t xml:space="preserve">Fuente: </w:t>
+              <w:t xml:space="preserve">Fuente: https://www.payara.fish/</w:t>
             </w:r>
             <w:hyperlink r:id="rId17" w:history="1">
               <w:r>
                 <w:rPr>
                   <w:rStyle w:val="Hipervnculo"/>
                 </w:rPr>
-                <w:t>https://www.payara.fish/</w:t>
+                <w:t/>
               </w:r>
             </w:hyperlink>
           </w:p>
@@ -12708,7 +12667,7 @@
               <w:cnfStyle w:val="000000100000" w:firstRow="0" w:lastRow="0" w:firstColumn="0" w:lastColumn="0" w:oddVBand="0" w:evenVBand="0" w:oddHBand="1" w:evenHBand="0" w:firstRowFirstColumn="0" w:firstRowLastColumn="0" w:lastRowFirstColumn="0" w:lastRowLastColumn="0"/>
             </w:pPr>
             <w:r>
-              <w:t xml:space="preserve">Distribución: Código abierto </w:t>
+              <w:t xml:space="preserve">Distribución: código abierto.</w:t>
             </w:r>
           </w:p>
           <w:p>
@@ -12716,7 +12675,7 @@
               <w:cnfStyle w:val="000000100000" w:firstRow="0" w:lastRow="0" w:firstColumn="0" w:lastColumn="0" w:oddVBand="0" w:evenVBand="0" w:oddHBand="1" w:evenHBand="0" w:firstRowFirstColumn="0" w:firstRowLastColumn="0" w:lastRowFirstColumn="0" w:lastRowLastColumn="0"/>
             </w:pPr>
             <w:r>
-              <w:t xml:space="preserve">Precio: Gratuito </w:t>
+              <w:t xml:space="preserve">Precio: gratuito.</w:t>
             </w:r>
           </w:p>
         </w:tc>
@@ -12729,15 +12688,13 @@
               <w:cnfStyle w:val="000000100000" w:firstRow="0" w:lastRow="0" w:firstColumn="0" w:lastColumn="0" w:oddVBand="0" w:evenVBand="0" w:oddHBand="1" w:evenHBand="0" w:firstRowFirstColumn="0" w:firstRowLastColumn="0" w:lastRowFirstColumn="0" w:lastRowLastColumn="0"/>
             </w:pPr>
             <w:r>
-              <w:t xml:space="preserve">Servidor de aplicaciones nativo para la nube y de código abierto, optimizado para desplegar aplicaciones </w:t>
-            </w:r>
-            <w:proofErr w:type="spellStart"/>
-            <w:r>
-              <w:t>Jakarta</w:t>
-            </w:r>
-            <w:proofErr w:type="spellEnd"/>
-            <w:r>
-              <w:t xml:space="preserve"> EE de forma segura y robusta.</w:t>
+              <w:t xml:space="preserve">Servidor Jakarta EE que ejecuta aplicaciones web empaquetadas como WAR.</w:t>
+            </w:r>
+            <w:r>
+              <w:t/>
+            </w:r>
+            <w:r>
+              <w:t xml:space="preserve"/>
             </w:r>
           </w:p>
         </w:tc>
@@ -12750,7 +12707,7 @@
               <w:cnfStyle w:val="000000100000" w:firstRow="0" w:lastRow="0" w:firstColumn="0" w:lastColumn="0" w:oddVBand="0" w:evenVBand="0" w:oddHBand="1" w:evenHBand="0" w:firstRowFirstColumn="0" w:firstRowLastColumn="0" w:lastRowFirstColumn="0" w:lastRowLastColumn="0"/>
             </w:pPr>
             <w:r>
-              <w:t>Alojar, compilar y mantener en ejecución el proyecto del backend. Es el encargado de exponer los servicios en la red para que los cuatro clientes puedan conectarse.</w:t>
+              <w:t>Alojar y ejecutar el backend del proyecto; la configuración local usa Payara Server 7.2026.10.</w:t>
             </w:r>
           </w:p>
         </w:tc>
@@ -12786,16 +12743,16 @@
     </w:p>
     <w:p>
       <w:r>
-        <w:t>El sistema</w:t>
-      </w:r>
-      <w:r>
-        <w:t xml:space="preserve"> de</w:t>
-      </w:r>
-      <w:r>
-        <w:t xml:space="preserve"> </w:t>
-      </w:r>
-      <w:r>
-        <w:t>“Conversor de Unidades Monster” no interactúa con bases de datos. La comunicación se realiza de forma exclusiva a través de la red utilizando el protocolo HTTP/HTTPS.</w:t>
+        <w:t>El sistema no interactúa con bases de datos. La comunicación con el backend se realiza por HTTP.</w:t>
+      </w:r>
+      <w:r>
+        <w:t xml:space="preserve"/>
+      </w:r>
+      <w:r>
+        <w:t xml:space="preserve"/>
+      </w:r>
+      <w:r>
+        <w:t/>
       </w:r>
     </w:p>
     <w:p>
@@ -12807,7 +12764,7 @@
         </w:numPr>
       </w:pPr>
       <w:r>
-        <w:t>Intercambio de datos: La comunicación entre los cuatro clientes (web, móvil, escritorio, consola) y el servidor central se rige por el estándar SOAP sobre la plataforma JAVA.</w:t>
+        <w:t>Intercambio de datos: Los cuatro clientes consumen servicios SOAP 1.1 sobre HTTP mediante Jakarta XML Web Services.</w:t>
       </w:r>
     </w:p>
     <w:p>
@@ -12819,7 +12776,7 @@
         </w:numPr>
       </w:pPr>
       <w:r>
-        <w:t>Formato de datos: Tanto las peticiones enviadas por los clientes como las respuestas generadas por el servidor se estructuran en formato XML, de acuerdo con el contrato definido en el archivo WSDL.</w:t>
+        <w:t>Formato de datos: Solicitudes y respuestas SOAP usan XML; JAX-WS genera el contrato WSDL.</w:t>
       </w:r>
     </w:p>
     <w:p>
@@ -13384,7 +13341,6 @@
               </w:rPr>
               <w:t xml:space="preserve">Persona que interactúa con las interfaces gráficas o de consola de la aplicación cliente. Es quien ingresa las credenciales del </w:t>
             </w:r>
-            <w:proofErr w:type="spellStart"/>
             <w:r>
               <w:rPr>
                 <w:rFonts w:ascii="Calibri" w:hAnsi="Calibri" w:cstheme="minorHAnsi"/>
@@ -13393,7 +13349,6 @@
               </w:rPr>
               <w:t>login</w:t>
             </w:r>
-            <w:proofErr w:type="spellEnd"/>
             <w:r>
               <w:rPr>
                 <w:rFonts w:ascii="Calibri" w:hAnsi="Calibri" w:cstheme="minorHAnsi"/>
@@ -15455,28 +15410,24 @@
               </w:rPr>
               <w:t xml:space="preserve"> </w:t>
             </w:r>
-            <w:proofErr w:type="spellStart"/>
             <w:r>
               <w:rPr>
                 <w:rFonts w:ascii="Calibri" w:hAnsi="Calibri" w:cstheme="minorHAnsi"/>
               </w:rPr>
               <w:t>farenheit</w:t>
             </w:r>
-            <w:proofErr w:type="spellEnd"/>
             <w:r>
               <w:rPr>
                 <w:rFonts w:ascii="Calibri" w:hAnsi="Calibri" w:cstheme="minorHAnsi"/>
               </w:rPr>
               <w:t xml:space="preserve">, kelvin, Celsius, newton y </w:t>
             </w:r>
-            <w:proofErr w:type="spellStart"/>
             <w:r>
               <w:rPr>
                 <w:rFonts w:ascii="Calibri" w:hAnsi="Calibri" w:cstheme="minorHAnsi"/>
               </w:rPr>
               <w:t>reaumur</w:t>
             </w:r>
-            <w:proofErr w:type="spellEnd"/>
           </w:p>
           <w:p>
             <w:pPr>
@@ -15533,13 +15484,13 @@
     </w:p>
     <w:p>
       <w:r>
-        <w:t>Para el Sistema “Servicio de Mantenimiento de Vehículos Monster”</w:t>
-      </w:r>
-      <w:r>
-        <w:t xml:space="preserve"> se ha identificado los siguientes requerimientos no funcionales en relación con la tecnología de la información</w:t>
-      </w:r>
-      <w:r>
-        <w:t>.</w:t>
+        <w:t>Para el sistema GR09 “Conversión de Unidades Monster” se describen los requisitos no funcionales de la variante implementada.</w:t>
+      </w:r>
+      <w:r>
+        <w:t xml:space="preserve"/>
+      </w:r>
+      <w:r>
+        <w:t/>
       </w:r>
     </w:p>
     <w:p>
@@ -15676,11 +15627,6 @@
           </w:tcPr>
           <w:p>
             <w:r>
-              <w:rPr>
-                <w:rFonts w:ascii="Arial" w:hAnsi="Arial"/>
-                <w:b/>
-                <w:color w:val="FFFFFF" w:themeColor="background1"/>
-              </w:rPr>
               <w:t>Protocolo de Arquitectura (SOAP)</w:t>
             </w:r>
           </w:p>
@@ -15723,7 +15669,7 @@
           </w:tcPr>
           <w:p>
             <w:r>
-              <w:t>El servidor central debe exponer sus servicios de conversión y autenticación estrictamente mediante el protocolo SOAP 1.1/1.2, utilizando archivos WSDL y esquemas XSD para definir el contrato del servicio.</w:t>
+              <w:t>El servidor expone servicios SOAP 1.1 mediante Jakarta XML Web Services API 4.0.1 y Metro JAX-WS Runtime 4.0.2; el contrato WSDL define operaciones y mensajes XML.</w:t>
             </w:r>
           </w:p>
         </w:tc>
@@ -16074,7 +16020,7 @@
           </w:tcPr>
           <w:p>
             <w:r>
-              <w:t>El backend del sistema debe ser desarrollado utilizando el lenguaje Java (JDK 17/21) e implementando la especificación Jakarta XML Web Services (JAX-WS) para la construcción de los servicios web.</w:t>
+              <w:t>El backend se compila con Java 11, Jakarta EE Web API 10.0.0, Jakarta XML Web Services API 4.0.1 y Metro JAX-WS Runtime 4.0.2.</w:t>
             </w:r>
           </w:p>
         </w:tc>
@@ -16394,7 +16340,7 @@
           </w:tcPr>
           <w:p>
             <w:r>
-              <w:t>El código fuente del servidor de conversiones debe ser construido, gestionado y estructurado utilizando el Entorno de Desarrollo Integrado (IDE) NetBeans con soporte Maven.</w:t>
+              <w:t>El proyecto Java usa NetBeans y Apache Maven; los archivos del proyecto no fijan versión de NetBeans.</w:t>
             </w:r>
           </w:p>
         </w:tc>
@@ -16557,7 +16503,7 @@
           <w:i w:val="0"/>
           <w:iCs w:val="0"/>
         </w:rPr>
-        <w:t xml:space="preserve">Tabla </w:t>
+        <w:t xml:space="preserve">Tabla 29. Requerimiento no funcional Servidor de Aplicaciones</w:t>
       </w:r>
       <w:r>
         <w:rPr>
@@ -16593,7 +16539,7 @@
           <w:i w:val="0"/>
           <w:iCs w:val="0"/>
         </w:rPr>
-        <w:t>29</w:t>
+        <w:t/>
       </w:r>
       <w:r>
         <w:rPr>
@@ -16611,7 +16557,7 @@
           <w:i w:val="0"/>
           <w:iCs w:val="0"/>
         </w:rPr>
-        <w:t xml:space="preserve">. Requerimiento no funcional </w:t>
+        <w:t xml:space="preserve"/>
       </w:r>
       <w:bookmarkEnd w:id="77"/>
       <w:r>
@@ -16621,7 +16567,7 @@
           <w:i w:val="0"/>
           <w:iCs w:val="0"/>
         </w:rPr>
-        <w:t>Servidor de Aplicaciones</w:t>
+        <w:t/>
       </w:r>
     </w:p>
     <w:tbl>
@@ -16738,7 +16684,7 @@
           </w:tcPr>
           <w:p>
             <w:r>
-              <w:t>El despliegue y la ejecución en red del proyecto backend debe realizarse sobre Payara Server / Tomcat o mediante servidor embebido JAX-WS.</w:t>
+              <w:t>El backend se despliega como WAR en Payara Server 7.2026.10.</w:t>
             </w:r>
           </w:p>
         </w:tc>
@@ -17097,7 +17043,7 @@
           </w:tcPr>
           <w:p>
             <w:r>
-              <w:t>El sistema debe restringir el acceso a los servicios de cálculo matemático. Solo procesará aquellas peticiones SOAP que incluyan un token de autenticación válido generado por el Login en memoria.</w:t>
+              <w:t>Cada operación de conversión SOAP requiere el token generado por el login; el backend lo valida en memoria antes de procesar la solicitud.</w:t>
             </w:r>
           </w:p>
         </w:tc>
@@ -18211,7 +18157,7 @@
     </w:p>
     <w:p>
       <w:r>
-        <w:t>Portabilidad. - Al tratarse de una arquitectura SOA utilizando SOAP en JAVA, el sistema garantiza que cualquier cliente pueda consumir los servicios mediante el intercambio de mensajes XML, independiente del lenguaje de programación del cliente.</w:t>
+        <w:t>Portabilidad. Los clientes consumen SOAP 1.1 mediante mensajes XML y WSDL, sin depender del lenguaje de programación del cliente.</w:t>
       </w:r>
     </w:p>
     <w:p>
@@ -18440,14 +18386,12 @@
         </w:rPr>
         <w:t xml:space="preserve">Menús numéricos textuales para navegar entre las opciones de </w:t>
       </w:r>
-      <w:proofErr w:type="spellStart"/>
       <w:r>
         <w:rPr>
           <w:lang w:val="es-EC"/>
         </w:rPr>
         <w:t>login</w:t>
       </w:r>
-      <w:proofErr w:type="spellEnd"/>
       <w:r>
         <w:rPr>
           <w:lang w:val="es-EC"/>
@@ -18496,7 +18440,6 @@
         </w:rPr>
         <w:t xml:space="preserve">Periféricos de entrada (teclado, ratón y </w:t>
       </w:r>
-      <w:proofErr w:type="spellStart"/>
       <w:r>
         <w:rPr>
           <w:b/>
@@ -18504,7 +18447,6 @@
         </w:rPr>
         <w:t>touch</w:t>
       </w:r>
-      <w:proofErr w:type="spellEnd"/>
       <w:r>
         <w:rPr>
           <w:b/>
@@ -18518,11 +18460,9 @@
       <w:r>
         <w:t xml:space="preserve">Necesarios para interactuar con el sistema, tipear los valores a </w:t>
       </w:r>
-      <w:proofErr w:type="gramStart"/>
       <w:r>
         <w:t>convertir ,</w:t>
       </w:r>
-      <w:proofErr w:type="gramEnd"/>
       <w:r>
         <w:t xml:space="preserve"> seleccionar las unidades y consumir los servicios web.</w:t>
       </w:r>
@@ -18585,7 +18525,7 @@
         </w:rPr>
       </w:pPr>
       <w:r>
-        <w:t>Los cuatro clientes y el servidor central de conversiones se comunicarán a través de la red utilizando el protocolo HTTP/HTTPS, intercambiando información estructurada mediante el estándar de mensajería SOAP y respetando el contrato definido en el archivo WSDL.</w:t>
+        <w:t>Los cuatro clientes se comunican con el servidor mediante SOAP 1.1 sobre HTTP e intercambian XML conforme al WSDL.</w:t>
       </w:r>
     </w:p>
     <w:p>
@@ -18635,7 +18575,7 @@
         </w:numPr>
       </w:pPr>
       <w:r>
-        <w:t>Es importante mantener un control de versionamiento en el archivo WSDL. Cualquier modificación en los parámetros del servidor requiere actualización en el código de los cuatro clientes para evitar fallos en la comunicación.</w:t>
+        <w:t>Es importante mantener versionado el contrato WSDL. Un cambio de operación o mensaje puede requerir actualizar los cuatro clientes.</w:t>
       </w:r>
     </w:p>
     <w:p>
@@ -18714,12 +18654,12 @@
     </w:p>
     <w:p>
       <w:r>
-        <w:t>2. World Wide Web Consortium (W3C). (2007). SOAP Version 1.2 Part 1: Messaging Framework (Second Edition). W3C Recommendation.</w:t>
+        <w:t>2. World Wide Web Consortium (W3C). (2000). Simple Object Access Protocol (SOAP) 1.1. https://www.w3.org/TR/soap11/</w:t>
       </w:r>
     </w:p>
     <w:p>
       <w:r>
-        <w:t>3. Oracle Corporation. (2023). Java Platform, Standard Edition &amp; Java Web Services Documentation (JAX-WS).</w:t>
+        <w:t>3. Eclipse Foundation. Jakarta XML Web Services 4.0. https://jakarta.ee/specifications/xml-web-services/4.0/</w:t>
       </w:r>
     </w:p>
     <w:p>

</xml_diff>